<commit_message>
docs: price TrueYield licence, data platform and ML discovery engine
Revise the Jharkhand TrueYield proposal: add a perpetual state-wide
licence for the existing detection engine and console; a production
data platform (common data lake with scheduled ingestion, Trino query
engine, data-quality checks, connectors) in place of the PoC
federation; and a three-layer ML discovery engine (unsupervised,
classification, rule finding) whose reviewed rules feed the detection
engine. One-time Rs 1.14-1.52 cr (pilot Rs 34-44 lakh), recurring
Rs 33-51 lakh a year. Adds an architecture diagram and a discovery
engine section; updates phases, risks and the internal pricing note.

Co-Authored-By: Claude Opus 5.5 <noreply@anthropic.com>
Claude-Session: https://claude.ai/code/session_01KWMWvQ91DXYjjkruj1UFSM
</commit_message>
<xml_diff>
--- a/docs/jharkhand-trueyield-2026/TrueYield_Jharkhand_Proposal.docx
+++ b/docs/jharkhand-trueyield-2026/TrueYield_Jharkhand_Proposal.docx
@@ -287,7 +287,7 @@
                 <w:sz w:val="30"/>
                 <w:szCs w:val="30"/>
               </w:rPr>
-              <w:t xml:space="preserve">₹28–38 lakh</w:t>
+              <w:t xml:space="preserve">₹34–44 lakh</w:t>
             </w:r>
           </w:p>
           <w:p>
@@ -338,7 +338,7 @@
                 <w:sz w:val="30"/>
                 <w:szCs w:val="30"/>
               </w:rPr>
-              <w:t xml:space="preserve">Already built</w:t>
+              <w:t xml:space="preserve">Two engines</w:t>
             </w:r>
           </w:p>
           <w:p>
@@ -353,7 +353,7 @@
                 <w:sz w:val="16"/>
                 <w:szCs w:val="16"/>
               </w:rPr>
-              <w:t xml:space="preserve">working platform; adapted, not developed from scratch</w:t>
+              <w:t xml:space="preserve">detection (built) + ML discovery</w:t>
             </w:r>
           </w:p>
         </w:tc>
@@ -456,7 +456,7 @@
           <w:sz w:val="19"/>
           <w:szCs w:val="19"/>
         </w:rPr>
-        <w:t xml:space="preserve">4   What the CAG found, and how TrueYield would catch it</w:t>
+        <w:t xml:space="preserve">4   The discovery engine: finding the rules no one has written yet</w:t>
       </w:r>
     </w:p>
     <w:p>
@@ -470,7 +470,7 @@
           <w:sz w:val="19"/>
           <w:szCs w:val="19"/>
         </w:rPr>
-        <w:t xml:space="preserve">5   Approach and methodology</w:t>
+        <w:t xml:space="preserve">5   What the CAG found, and how TrueYield would catch it</w:t>
       </w:r>
     </w:p>
     <w:p>
@@ -484,7 +484,7 @@
           <w:sz w:val="19"/>
           <w:szCs w:val="19"/>
         </w:rPr>
-        <w:t xml:space="preserve">6   Benefits</w:t>
+        <w:t xml:space="preserve">6   Approach and methodology</w:t>
       </w:r>
     </w:p>
     <w:p>
@@ -498,7 +498,7 @@
           <w:sz w:val="19"/>
           <w:szCs w:val="19"/>
         </w:rPr>
-        <w:t xml:space="preserve">7   Indicative cost</w:t>
+        <w:t xml:space="preserve">7   Benefits</w:t>
       </w:r>
     </w:p>
     <w:p>
@@ -512,7 +512,7 @@
           <w:sz w:val="19"/>
           <w:szCs w:val="19"/>
         </w:rPr>
-        <w:t xml:space="preserve">8   Key risks and safeguards</w:t>
+        <w:t xml:space="preserve">8   Indicative cost</w:t>
       </w:r>
     </w:p>
     <w:p>
@@ -526,10 +526,27 @@
           <w:sz w:val="19"/>
           <w:szCs w:val="19"/>
         </w:rPr>
-        <w:t xml:space="preserve">9   How we will work with the Government</w:t>
+        <w:t xml:space="preserve">9   Key risks and safeguards</w:t>
       </w:r>
     </w:p>
     <w:p>
+      <w:pPr>
+        <w:spacing w:after="40" w:before="0" w:line="264"/>
+      </w:pPr>
+      <w:r>
+        <w:rPr>
+          <w:rFonts w:ascii="Arial" w:cs="Arial" w:eastAsia="Arial" w:hAnsi="Arial"/>
+          <w:color w:val="1F2937"/>
+          <w:sz w:val="19"/>
+          <w:szCs w:val="19"/>
+        </w:rPr>
+        <w:t xml:space="preserve">10  How we will work with the Government</w:t>
+      </w:r>
+    </w:p>
+    <w:p>
+      <w:pPr>
+        <w:spacing w:after="0" w:before="0" w:line="20"/>
+      </w:pPr>
       <w:r>
         <w:br w:type="page"/>
       </w:r>
@@ -577,7 +594,7 @@
           <w:sz w:val="19"/>
           <w:szCs w:val="19"/>
         </w:rPr>
-        <w:t xml:space="preserve">TrueYield is a revenue-leakage analytics platform that reads each department's records where they sit, compares them for the same taxpayer, and produces a ranked, rupee-quantified list of cases for officers to verify. It does not replace any departmental system and does not assess anyone; it tells officers where to look and shows the arithmetic behind every figure.</w:t>
+        <w:t xml:space="preserve">TrueYield is a revenue-leakage analytics platform. It brings each department's records into a common data lake on a regular schedule, compares them for the same taxpayer, and produces a ranked, rupee-quantified list of cases for officers to verify. A detection engine applies known rules; a discovery engine uses machine learning to find new patterns and turn them into rules. It does not replace any departmental system and does not assess anyone; it tells officers where to look and shows the arithmetic behind every figure.</w:t>
       </w:r>
     </w:p>
     <w:p>
@@ -738,7 +755,7 @@
                 <w:sz w:val="19"/>
                 <w:szCs w:val="19"/>
               </w:rPr>
-              <w:t xml:space="preserve">the platform is already built and running on test data with a library of 85 checks across 10 families; it is adapted to Jharkhand's statutes and registers, not developed from scratch.</w:t>
+              <w:t xml:space="preserve">the detection engine is our product, already running on test data with a library of 85 checks across 10 families; it is licensed and adapted to Jharkhand, while the state-scale data platform and the ML discovery engine are built for Jharkhand.</w:t>
             </w:r>
           </w:p>
           <w:p>
@@ -769,7 +786,7 @@
                 <w:sz w:val="19"/>
                 <w:szCs w:val="19"/>
               </w:rPr>
-              <w:t xml:space="preserve">4 months, 3 departments, 3 districts, read-only access, ₹28–38 lakh. Full rollout only if the pilot's verified results justify it.</w:t>
+              <w:t xml:space="preserve">4 months, 3 departments, 3 districts, read-only access, ₹34–44 lakh. Full rollout only if the pilot's verified results justify it.</w:t>
             </w:r>
           </w:p>
           <w:p>
@@ -800,7 +817,7 @@
                 <w:sz w:val="19"/>
                 <w:szCs w:val="19"/>
               </w:rPr>
-              <w:t xml:space="preserve">₹68–92 lakh one-time for the full state rollout, and ₹16–26 lakh a year to run.</w:t>
+              <w:t xml:space="preserve">₹1.14–1.52 cr one-time for the full state rollout including the platform licence, data platform and discovery engine, and ₹33–51 lakh a year to run.</w:t>
             </w:r>
           </w:p>
         </w:tc>
@@ -934,10 +951,33 @@
           <w:sz w:val="19"/>
           <w:szCs w:val="19"/>
         </w:rPr>
-        <w:t xml:space="preserve">Data stays with each department; the platform reads, never writes, and runs in the Jharkhand State Data Centre.</w:t>
+        <w:t xml:space="preserve">New rules found by machine learning, reviewed by officers before they are used.</w:t>
       </w:r>
     </w:p>
     <w:p>
+      <w:pPr>
+        <w:pStyle w:val="ListParagraph"/>
+        <w:keepLines/>
+        <w:numPr>
+          <w:ilvl w:val="0"/>
+          <w:numId w:val="2"/>
+        </w:numPr>
+        <w:spacing w:after="50" w:line="256"/>
+      </w:pPr>
+      <w:r>
+        <w:rPr>
+          <w:rFonts w:ascii="Arial" w:cs="Arial" w:eastAsia="Arial" w:hAnsi="Arial"/>
+          <w:color w:val="1F2937"/>
+          <w:sz w:val="19"/>
+          <w:szCs w:val="19"/>
+        </w:rPr>
+        <w:t xml:space="preserve">Departments' own systems are untouched; data is copied read-only into a secure data lake in the Jharkhand State Data Centre.</w:t>
+      </w:r>
+    </w:p>
+    <w:p>
+      <w:pPr>
+        <w:spacing w:after="0" w:before="0" w:line="20"/>
+      </w:pPr>
       <w:r>
         <w:br w:type="page"/>
       </w:r>
@@ -2023,6 +2063,9 @@
       </w:tr>
     </w:tbl>
     <w:p>
+      <w:pPr>
+        <w:spacing w:after="0" w:before="0" w:line="20"/>
+      </w:pPr>
       <w:r>
         <w:br w:type="page"/>
       </w:r>
@@ -4791,6 +4834,9 @@
       </w:tr>
     </w:tbl>
     <w:p>
+      <w:pPr>
+        <w:spacing w:after="0" w:before="0" w:line="20"/>
+      </w:pPr>
       <w:r>
         <w:br w:type="page"/>
       </w:r>
@@ -4835,7 +4881,788 @@
           <w:sz w:val="19"/>
           <w:szCs w:val="19"/>
         </w:rPr>
-        <w:t xml:space="preserve">TrueYield connects to each department's database in read-only mode, maps its tables to a common vocabulary, and runs a library of checks that compare records for the same taxpayer (linked by PAN, GSTIN, or matched on name, address and mobile where no shared key exists). Every finding carries its inputs, arithmetic, statutory rate and the officer accountable for it.</w:t>
+        <w:t xml:space="preserve">TrueYield has four layers. Data is extracted read-only from each department on a schedule and held in one place; a query engine makes it searchable at state scale; the detection engine applies the rulebook; and the discovery engine looks for patterns the rulebook does not yet cover.</w:t>
+      </w:r>
+    </w:p>
+    <w:tbl>
+      <w:tblPr>
+        <w:tblW w:type="dxa" w:w="10206"/>
+        <w:tblBorders>
+          <w:top w:val="single" w:color="auto" w:sz="4"/>
+          <w:left w:val="single" w:color="auto" w:sz="4"/>
+          <w:bottom w:val="single" w:color="auto" w:sz="4"/>
+          <w:right w:val="single" w:color="auto" w:sz="4"/>
+          <w:insideH w:val="single" w:color="auto" w:sz="4"/>
+          <w:insideV w:val="single" w:color="auto" w:sz="4"/>
+        </w:tblBorders>
+        <w:tblLayout w:type="fixed"/>
+      </w:tblPr>
+      <w:tblGrid>
+        <w:gridCol w:w="1780"/>
+        <w:gridCol w:w="327"/>
+        <w:gridCol w:w="1780"/>
+        <w:gridCol w:w="327"/>
+        <w:gridCol w:w="1780"/>
+        <w:gridCol w:w="327"/>
+        <w:gridCol w:w="1780"/>
+        <w:gridCol w:w="327"/>
+        <w:gridCol w:w="1778"/>
+      </w:tblGrid>
+      <w:tr>
+        <w:trPr>
+          <w:cantSplit/>
+        </w:trPr>
+        <w:tc>
+          <w:tcPr>
+            <w:tcW w:type="dxa" w:w="1780"/>
+            <w:tcBorders>
+              <w:top w:val="single" w:color="CBD5E1" w:sz="4"/>
+              <w:left w:val="single" w:color="CBD5E1" w:sz="4"/>
+              <w:bottom w:val="single" w:color="CBD5E1" w:sz="4"/>
+              <w:right w:val="single" w:color="CBD5E1" w:sz="4"/>
+            </w:tcBorders>
+            <w:shd w:fill="F7F9FC" w:color="auto" w:val="clear"/>
+            <w:tcMar>
+              <w:top w:type="dxa" w:w="70"/>
+              <w:left w:type="dxa" w:w="110"/>
+              <w:bottom w:type="dxa" w:w="70"/>
+              <w:right w:type="dxa" w:w="110"/>
+            </w:tcMar>
+            <w:vAlign w:val="center"/>
+          </w:tcPr>
+          <w:p>
+            <w:pPr>
+              <w:spacing w:after="20" w:before="0" w:line="264"/>
+              <w:jc w:val="center"/>
+            </w:pPr>
+            <w:r>
+              <w:rPr>
+                <w:rFonts w:ascii="Arial" w:cs="Arial" w:eastAsia="Arial" w:hAnsi="Arial"/>
+                <w:b/>
+                <w:bCs/>
+                <w:color w:val="1B2A44"/>
+                <w:sz w:val="16"/>
+                <w:szCs w:val="16"/>
+              </w:rPr>
+              <w:t xml:space="preserve">Department systems</w:t>
+            </w:r>
+          </w:p>
+          <w:p>
+            <w:pPr>
+              <w:spacing w:after="0" w:before="0" w:line="220"/>
+              <w:jc w:val="center"/>
+            </w:pPr>
+            <w:r>
+              <w:rPr>
+                <w:rFonts w:ascii="Arial" w:cs="Arial" w:eastAsia="Arial" w:hAnsi="Arial"/>
+                <w:color w:val="5B6472"/>
+                <w:sz w:val="14"/>
+                <w:szCs w:val="14"/>
+              </w:rPr>
+              <w:t xml:space="preserve">GST · JIMMS · NGDRS · Jharbhoomi · VAHAN · excise · JBVNL</w:t>
+            </w:r>
+          </w:p>
+        </w:tc>
+        <w:tc>
+          <w:tcPr>
+            <w:tcW w:type="dxa" w:w="327"/>
+            <w:tcBorders>
+              <w:top w:val="none" w:color="FFFFFF" w:sz="0"/>
+              <w:left w:val="none" w:color="FFFFFF" w:sz="0"/>
+              <w:bottom w:val="none" w:color="FFFFFF" w:sz="0"/>
+              <w:right w:val="none" w:color="FFFFFF" w:sz="0"/>
+            </w:tcBorders>
+            <w:tcMar>
+              <w:top w:type="dxa" w:w="0"/>
+              <w:left w:type="dxa" w:w="110"/>
+              <w:bottom w:type="dxa" w:w="0"/>
+              <w:right w:type="dxa" w:w="110"/>
+            </w:tcMar>
+            <w:vAlign w:val="center"/>
+          </w:tcPr>
+          <w:p>
+            <w:pPr>
+              <w:spacing w:after="0" w:before="0" w:line="264"/>
+              <w:jc w:val="center"/>
+            </w:pPr>
+            <w:r>
+              <w:rPr>
+                <w:rFonts w:ascii="Arial" w:cs="Arial" w:eastAsia="Arial" w:hAnsi="Arial"/>
+                <w:b/>
+                <w:bCs/>
+                <w:color w:val="0E7C7B"/>
+                <w:sz w:val="26"/>
+                <w:szCs w:val="26"/>
+              </w:rPr>
+              <w:t xml:space="preserve">→</w:t>
+            </w:r>
+          </w:p>
+        </w:tc>
+        <w:tc>
+          <w:tcPr>
+            <w:tcW w:type="dxa" w:w="1780"/>
+            <w:tcBorders>
+              <w:top w:val="single" w:color="CBD5E1" w:sz="4"/>
+              <w:left w:val="single" w:color="CBD5E1" w:sz="4"/>
+              <w:bottom w:val="single" w:color="CBD5E1" w:sz="4"/>
+              <w:right w:val="single" w:color="CBD5E1" w:sz="4"/>
+            </w:tcBorders>
+            <w:shd w:fill="E6F4F3" w:color="auto" w:val="clear"/>
+            <w:tcMar>
+              <w:top w:type="dxa" w:w="70"/>
+              <w:left w:type="dxa" w:w="110"/>
+              <w:bottom w:type="dxa" w:w="70"/>
+              <w:right w:type="dxa" w:w="110"/>
+            </w:tcMar>
+            <w:vAlign w:val="center"/>
+          </w:tcPr>
+          <w:p>
+            <w:pPr>
+              <w:spacing w:after="20" w:before="0" w:line="264"/>
+              <w:jc w:val="center"/>
+            </w:pPr>
+            <w:r>
+              <w:rPr>
+                <w:rFonts w:ascii="Arial" w:cs="Arial" w:eastAsia="Arial" w:hAnsi="Arial"/>
+                <w:b/>
+                <w:bCs/>
+                <w:color w:val="1B2A44"/>
+                <w:sz w:val="16"/>
+                <w:szCs w:val="16"/>
+              </w:rPr>
+              <w:t xml:space="preserve">Scheduled ingestion</w:t>
+            </w:r>
+          </w:p>
+          <w:p>
+            <w:pPr>
+              <w:spacing w:after="0" w:before="0" w:line="220"/>
+              <w:jc w:val="center"/>
+            </w:pPr>
+            <w:r>
+              <w:rPr>
+                <w:rFonts w:ascii="Arial" w:cs="Arial" w:eastAsia="Arial" w:hAnsi="Arial"/>
+                <w:color w:val="5B6472"/>
+                <w:sz w:val="14"/>
+                <w:szCs w:val="14"/>
+              </w:rPr>
+              <w:t xml:space="preserve">read-only extracts on a set frequency, quality checks</w:t>
+            </w:r>
+          </w:p>
+        </w:tc>
+        <w:tc>
+          <w:tcPr>
+            <w:tcW w:type="dxa" w:w="327"/>
+            <w:tcBorders>
+              <w:top w:val="none" w:color="FFFFFF" w:sz="0"/>
+              <w:left w:val="none" w:color="FFFFFF" w:sz="0"/>
+              <w:bottom w:val="none" w:color="FFFFFF" w:sz="0"/>
+              <w:right w:val="none" w:color="FFFFFF" w:sz="0"/>
+            </w:tcBorders>
+            <w:tcMar>
+              <w:top w:type="dxa" w:w="0"/>
+              <w:left w:type="dxa" w:w="110"/>
+              <w:bottom w:type="dxa" w:w="0"/>
+              <w:right w:type="dxa" w:w="110"/>
+            </w:tcMar>
+            <w:vAlign w:val="center"/>
+          </w:tcPr>
+          <w:p>
+            <w:pPr>
+              <w:spacing w:after="0" w:before="0" w:line="264"/>
+              <w:jc w:val="center"/>
+            </w:pPr>
+            <w:r>
+              <w:rPr>
+                <w:rFonts w:ascii="Arial" w:cs="Arial" w:eastAsia="Arial" w:hAnsi="Arial"/>
+                <w:b/>
+                <w:bCs/>
+                <w:color w:val="0E7C7B"/>
+                <w:sz w:val="26"/>
+                <w:szCs w:val="26"/>
+              </w:rPr>
+              <w:t xml:space="preserve">→</w:t>
+            </w:r>
+          </w:p>
+        </w:tc>
+        <w:tc>
+          <w:tcPr>
+            <w:tcW w:type="dxa" w:w="1780"/>
+            <w:tcBorders>
+              <w:top w:val="single" w:color="CBD5E1" w:sz="4"/>
+              <w:left w:val="single" w:color="CBD5E1" w:sz="4"/>
+              <w:bottom w:val="single" w:color="CBD5E1" w:sz="4"/>
+              <w:right w:val="single" w:color="CBD5E1" w:sz="4"/>
+            </w:tcBorders>
+            <w:shd w:fill="E6F4F3" w:color="auto" w:val="clear"/>
+            <w:tcMar>
+              <w:top w:type="dxa" w:w="70"/>
+              <w:left w:type="dxa" w:w="110"/>
+              <w:bottom w:type="dxa" w:w="70"/>
+              <w:right w:type="dxa" w:w="110"/>
+            </w:tcMar>
+            <w:vAlign w:val="center"/>
+          </w:tcPr>
+          <w:p>
+            <w:pPr>
+              <w:spacing w:after="20" w:before="0" w:line="264"/>
+              <w:jc w:val="center"/>
+            </w:pPr>
+            <w:r>
+              <w:rPr>
+                <w:rFonts w:ascii="Arial" w:cs="Arial" w:eastAsia="Arial" w:hAnsi="Arial"/>
+                <w:b/>
+                <w:bCs/>
+                <w:color w:val="1B2A44"/>
+                <w:sz w:val="16"/>
+                <w:szCs w:val="16"/>
+              </w:rPr>
+              <w:t xml:space="preserve">Common data lake</w:t>
+            </w:r>
+          </w:p>
+          <w:p>
+            <w:pPr>
+              <w:spacing w:after="0" w:before="0" w:line="220"/>
+              <w:jc w:val="center"/>
+            </w:pPr>
+            <w:r>
+              <w:rPr>
+                <w:rFonts w:ascii="Arial" w:cs="Arial" w:eastAsia="Arial" w:hAnsi="Arial"/>
+                <w:color w:val="5B6472"/>
+                <w:sz w:val="14"/>
+                <w:szCs w:val="14"/>
+              </w:rPr>
+              <w:t xml:space="preserve">State Data Centre, open table format, full history</w:t>
+            </w:r>
+          </w:p>
+        </w:tc>
+        <w:tc>
+          <w:tcPr>
+            <w:tcW w:type="dxa" w:w="327"/>
+            <w:tcBorders>
+              <w:top w:val="none" w:color="FFFFFF" w:sz="0"/>
+              <w:left w:val="none" w:color="FFFFFF" w:sz="0"/>
+              <w:bottom w:val="none" w:color="FFFFFF" w:sz="0"/>
+              <w:right w:val="none" w:color="FFFFFF" w:sz="0"/>
+            </w:tcBorders>
+            <w:tcMar>
+              <w:top w:type="dxa" w:w="0"/>
+              <w:left w:type="dxa" w:w="110"/>
+              <w:bottom w:type="dxa" w:w="0"/>
+              <w:right w:type="dxa" w:w="110"/>
+            </w:tcMar>
+            <w:vAlign w:val="center"/>
+          </w:tcPr>
+          <w:p>
+            <w:pPr>
+              <w:spacing w:after="0" w:before="0" w:line="264"/>
+              <w:jc w:val="center"/>
+            </w:pPr>
+            <w:r>
+              <w:rPr>
+                <w:rFonts w:ascii="Arial" w:cs="Arial" w:eastAsia="Arial" w:hAnsi="Arial"/>
+                <w:b/>
+                <w:bCs/>
+                <w:color w:val="0E7C7B"/>
+                <w:sz w:val="26"/>
+                <w:szCs w:val="26"/>
+              </w:rPr>
+              <w:t xml:space="preserve">→</w:t>
+            </w:r>
+          </w:p>
+        </w:tc>
+        <w:tc>
+          <w:tcPr>
+            <w:tcW w:type="dxa" w:w="1780"/>
+            <w:tcBorders>
+              <w:top w:val="single" w:color="CBD5E1" w:sz="4"/>
+              <w:left w:val="single" w:color="CBD5E1" w:sz="4"/>
+              <w:bottom w:val="single" w:color="CBD5E1" w:sz="4"/>
+              <w:right w:val="single" w:color="CBD5E1" w:sz="4"/>
+            </w:tcBorders>
+            <w:shd w:fill="E6F4F3" w:color="auto" w:val="clear"/>
+            <w:tcMar>
+              <w:top w:type="dxa" w:w="70"/>
+              <w:left w:type="dxa" w:w="110"/>
+              <w:bottom w:type="dxa" w:w="70"/>
+              <w:right w:type="dxa" w:w="110"/>
+            </w:tcMar>
+            <w:vAlign w:val="center"/>
+          </w:tcPr>
+          <w:p>
+            <w:pPr>
+              <w:spacing w:after="20" w:before="0" w:line="264"/>
+              <w:jc w:val="center"/>
+            </w:pPr>
+            <w:r>
+              <w:rPr>
+                <w:rFonts w:ascii="Arial" w:cs="Arial" w:eastAsia="Arial" w:hAnsi="Arial"/>
+                <w:b/>
+                <w:bCs/>
+                <w:color w:val="1B2A44"/>
+                <w:sz w:val="16"/>
+                <w:szCs w:val="16"/>
+              </w:rPr>
+              <w:t xml:space="preserve">Trino query engine</w:t>
+            </w:r>
+          </w:p>
+          <w:p>
+            <w:pPr>
+              <w:spacing w:after="0" w:before="0" w:line="220"/>
+              <w:jc w:val="center"/>
+            </w:pPr>
+            <w:r>
+              <w:rPr>
+                <w:rFonts w:ascii="Arial" w:cs="Arial" w:eastAsia="Arial" w:hAnsi="Arial"/>
+                <w:color w:val="5B6472"/>
+                <w:sz w:val="14"/>
+                <w:szCs w:val="14"/>
+              </w:rPr>
+              <w:t xml:space="preserve">state-scale SQL across the lake</w:t>
+            </w:r>
+          </w:p>
+        </w:tc>
+        <w:tc>
+          <w:tcPr>
+            <w:tcW w:type="dxa" w:w="327"/>
+            <w:tcBorders>
+              <w:top w:val="none" w:color="FFFFFF" w:sz="0"/>
+              <w:left w:val="none" w:color="FFFFFF" w:sz="0"/>
+              <w:bottom w:val="none" w:color="FFFFFF" w:sz="0"/>
+              <w:right w:val="none" w:color="FFFFFF" w:sz="0"/>
+            </w:tcBorders>
+            <w:tcMar>
+              <w:top w:type="dxa" w:w="0"/>
+              <w:left w:type="dxa" w:w="110"/>
+              <w:bottom w:type="dxa" w:w="0"/>
+              <w:right w:type="dxa" w:w="110"/>
+            </w:tcMar>
+            <w:vAlign w:val="center"/>
+          </w:tcPr>
+          <w:p>
+            <w:pPr>
+              <w:spacing w:after="0" w:before="0" w:line="264"/>
+              <w:jc w:val="center"/>
+            </w:pPr>
+            <w:r>
+              <w:rPr>
+                <w:rFonts w:ascii="Arial" w:cs="Arial" w:eastAsia="Arial" w:hAnsi="Arial"/>
+                <w:b/>
+                <w:bCs/>
+                <w:color w:val="0E7C7B"/>
+                <w:sz w:val="26"/>
+                <w:szCs w:val="26"/>
+              </w:rPr>
+              <w:t xml:space="preserve">→</w:t>
+            </w:r>
+          </w:p>
+        </w:tc>
+        <w:tc>
+          <w:tcPr>
+            <w:tcW w:type="dxa" w:w="1778"/>
+            <w:tcBorders>
+              <w:top w:val="single" w:color="CBD5E1" w:sz="4"/>
+              <w:left w:val="single" w:color="CBD5E1" w:sz="4"/>
+              <w:bottom w:val="single" w:color="CBD5E1" w:sz="4"/>
+              <w:right w:val="single" w:color="CBD5E1" w:sz="4"/>
+            </w:tcBorders>
+            <w:shd w:fill="FDF5E6" w:color="auto" w:val="clear"/>
+            <w:tcMar>
+              <w:top w:type="dxa" w:w="70"/>
+              <w:left w:type="dxa" w:w="110"/>
+              <w:bottom w:type="dxa" w:w="70"/>
+              <w:right w:type="dxa" w:w="110"/>
+            </w:tcMar>
+            <w:vAlign w:val="center"/>
+          </w:tcPr>
+          <w:p>
+            <w:pPr>
+              <w:spacing w:after="20" w:before="0" w:line="264"/>
+              <w:jc w:val="center"/>
+            </w:pPr>
+            <w:r>
+              <w:rPr>
+                <w:rFonts w:ascii="Arial" w:cs="Arial" w:eastAsia="Arial" w:hAnsi="Arial"/>
+                <w:b/>
+                <w:bCs/>
+                <w:color w:val="1B2A44"/>
+                <w:sz w:val="16"/>
+                <w:szCs w:val="16"/>
+              </w:rPr>
+              <w:t xml:space="preserve">Detection engine + console</w:t>
+            </w:r>
+          </w:p>
+          <w:p>
+            <w:pPr>
+              <w:spacing w:after="0" w:before="0" w:line="220"/>
+              <w:jc w:val="center"/>
+            </w:pPr>
+            <w:r>
+              <w:rPr>
+                <w:rFonts w:ascii="Arial" w:cs="Arial" w:eastAsia="Arial" w:hAnsi="Arial"/>
+                <w:color w:val="5B6472"/>
+                <w:sz w:val="14"/>
+                <w:szCs w:val="14"/>
+              </w:rPr>
+              <w:t xml:space="preserve">rulebook, money engine, worklists, assistant</w:t>
+            </w:r>
+          </w:p>
+        </w:tc>
+      </w:tr>
+      <w:tr>
+        <w:trPr>
+          <w:cantSplit/>
+        </w:trPr>
+        <w:tc>
+          <w:tcPr>
+            <w:tcW w:type="dxa" w:w="4214"/>
+            <w:gridSpan w:val="4"/>
+            <w:tcBorders>
+              <w:top w:val="none" w:color="FFFFFF" w:sz="0"/>
+              <w:left w:val="none" w:color="FFFFFF" w:sz="0"/>
+              <w:bottom w:val="none" w:color="FFFFFF" w:sz="0"/>
+              <w:right w:val="none" w:color="FFFFFF" w:sz="0"/>
+            </w:tcBorders>
+            <w:tcMar>
+              <w:top w:type="dxa" w:w="60"/>
+              <w:left w:type="dxa" w:w="110"/>
+              <w:bottom w:type="dxa" w:w="60"/>
+              <w:right w:type="dxa" w:w="110"/>
+            </w:tcMar>
+            <w:vAlign w:val="top"/>
+          </w:tcPr>
+          <w:p>
+            <w:pPr>
+              <w:spacing w:after="0" w:before="0" w:line="264"/>
+            </w:pPr>
+            <w:r>
+              <w:rPr>
+                <w:rFonts w:ascii="Arial" w:cs="Arial" w:eastAsia="Arial" w:hAnsi="Arial"/>
+                <w:color w:val="1F2937"/>
+                <w:sz w:val="19"/>
+                <w:szCs w:val="19"/>
+              </w:rPr>
+              <w:t xml:space="preserve"/>
+            </w:r>
+          </w:p>
+        </w:tc>
+        <w:tc>
+          <w:tcPr>
+            <w:tcW w:type="dxa" w:w="1780"/>
+            <w:tcBorders>
+              <w:top w:val="none" w:color="FFFFFF" w:sz="0"/>
+              <w:left w:val="none" w:color="FFFFFF" w:sz="0"/>
+              <w:bottom w:val="none" w:color="FFFFFF" w:sz="0"/>
+              <w:right w:val="none" w:color="FFFFFF" w:sz="0"/>
+            </w:tcBorders>
+            <w:tcMar>
+              <w:top w:type="dxa" w:w="0"/>
+              <w:left w:type="dxa" w:w="110"/>
+              <w:bottom w:type="dxa" w:w="0"/>
+              <w:right w:type="dxa" w:w="110"/>
+            </w:tcMar>
+            <w:vAlign w:val="center"/>
+          </w:tcPr>
+          <w:p>
+            <w:pPr>
+              <w:spacing w:after="0" w:before="0" w:line="264"/>
+              <w:jc w:val="center"/>
+            </w:pPr>
+            <w:r>
+              <w:rPr>
+                <w:rFonts w:ascii="Arial" w:cs="Arial" w:eastAsia="Arial" w:hAnsi="Arial"/>
+                <w:b/>
+                <w:bCs/>
+                <w:color w:val="0E7C7B"/>
+                <w:sz w:val="26"/>
+                <w:szCs w:val="26"/>
+              </w:rPr>
+              <w:t xml:space="preserve">↓</w:t>
+            </w:r>
+          </w:p>
+        </w:tc>
+        <w:tc>
+          <w:tcPr>
+            <w:tcW w:type="dxa" w:w="327"/>
+            <w:tcBorders>
+              <w:top w:val="none" w:color="FFFFFF" w:sz="0"/>
+              <w:left w:val="none" w:color="FFFFFF" w:sz="0"/>
+              <w:bottom w:val="none" w:color="FFFFFF" w:sz="0"/>
+              <w:right w:val="none" w:color="FFFFFF" w:sz="0"/>
+            </w:tcBorders>
+            <w:tcMar>
+              <w:top w:type="dxa" w:w="60"/>
+              <w:left w:type="dxa" w:w="110"/>
+              <w:bottom w:type="dxa" w:w="60"/>
+              <w:right w:type="dxa" w:w="110"/>
+            </w:tcMar>
+            <w:vAlign w:val="top"/>
+          </w:tcPr>
+          <w:p>
+            <w:pPr>
+              <w:spacing w:after="0" w:before="0" w:line="264"/>
+            </w:pPr>
+            <w:r>
+              <w:rPr>
+                <w:rFonts w:ascii="Arial" w:cs="Arial" w:eastAsia="Arial" w:hAnsi="Arial"/>
+                <w:color w:val="1F2937"/>
+                <w:sz w:val="19"/>
+                <w:szCs w:val="19"/>
+              </w:rPr>
+              <w:t xml:space="preserve"/>
+            </w:r>
+          </w:p>
+        </w:tc>
+        <w:tc>
+          <w:tcPr>
+            <w:tcW w:type="dxa" w:w="2107"/>
+            <w:gridSpan w:val="2"/>
+            <w:tcBorders>
+              <w:top w:val="none" w:color="FFFFFF" w:sz="0"/>
+              <w:left w:val="none" w:color="FFFFFF" w:sz="0"/>
+              <w:bottom w:val="none" w:color="FFFFFF" w:sz="0"/>
+              <w:right w:val="none" w:color="FFFFFF" w:sz="0"/>
+            </w:tcBorders>
+            <w:tcMar>
+              <w:top w:type="dxa" w:w="60"/>
+              <w:left w:type="dxa" w:w="110"/>
+              <w:bottom w:type="dxa" w:w="60"/>
+              <w:right w:type="dxa" w:w="110"/>
+            </w:tcMar>
+            <w:vAlign w:val="top"/>
+          </w:tcPr>
+          <w:p>
+            <w:pPr>
+              <w:spacing w:after="0" w:before="0" w:line="264"/>
+            </w:pPr>
+            <w:r>
+              <w:rPr>
+                <w:rFonts w:ascii="Arial" w:cs="Arial" w:eastAsia="Arial" w:hAnsi="Arial"/>
+                <w:color w:val="1F2937"/>
+                <w:sz w:val="19"/>
+                <w:szCs w:val="19"/>
+              </w:rPr>
+              <w:t xml:space="preserve"/>
+            </w:r>
+          </w:p>
+        </w:tc>
+        <w:tc>
+          <w:tcPr>
+            <w:tcW w:type="dxa" w:w="1778"/>
+            <w:tcBorders>
+              <w:top w:val="none" w:color="FFFFFF" w:sz="0"/>
+              <w:left w:val="none" w:color="FFFFFF" w:sz="0"/>
+              <w:bottom w:val="none" w:color="FFFFFF" w:sz="0"/>
+              <w:right w:val="none" w:color="FFFFFF" w:sz="0"/>
+            </w:tcBorders>
+            <w:tcMar>
+              <w:top w:type="dxa" w:w="0"/>
+              <w:left w:type="dxa" w:w="110"/>
+              <w:bottom w:type="dxa" w:w="0"/>
+              <w:right w:type="dxa" w:w="110"/>
+            </w:tcMar>
+            <w:vAlign w:val="center"/>
+          </w:tcPr>
+          <w:p>
+            <w:pPr>
+              <w:spacing w:after="0" w:before="0" w:line="264"/>
+              <w:jc w:val="center"/>
+            </w:pPr>
+            <w:r>
+              <w:rPr>
+                <w:rFonts w:ascii="Arial" w:cs="Arial" w:eastAsia="Arial" w:hAnsi="Arial"/>
+                <w:b/>
+                <w:bCs/>
+                <w:color w:val="0E7C7B"/>
+                <w:sz w:val="26"/>
+                <w:szCs w:val="26"/>
+              </w:rPr>
+              <w:t xml:space="preserve">↑</w:t>
+            </w:r>
+          </w:p>
+        </w:tc>
+      </w:tr>
+      <w:tr>
+        <w:trPr>
+          <w:cantSplit/>
+        </w:trPr>
+        <w:tc>
+          <w:tcPr>
+            <w:tcW w:type="dxa" w:w="4214"/>
+            <w:gridSpan w:val="4"/>
+            <w:tcBorders>
+              <w:top w:val="none" w:color="FFFFFF" w:sz="0"/>
+              <w:left w:val="none" w:color="FFFFFF" w:sz="0"/>
+              <w:bottom w:val="none" w:color="FFFFFF" w:sz="0"/>
+              <w:right w:val="none" w:color="FFFFFF" w:sz="0"/>
+            </w:tcBorders>
+            <w:tcMar>
+              <w:top w:type="dxa" w:w="60"/>
+              <w:left w:type="dxa" w:w="110"/>
+              <w:bottom w:type="dxa" w:w="60"/>
+              <w:right w:type="dxa" w:w="110"/>
+            </w:tcMar>
+            <w:vAlign w:val="top"/>
+          </w:tcPr>
+          <w:p>
+            <w:pPr>
+              <w:spacing w:after="0" w:before="0" w:line="264"/>
+            </w:pPr>
+            <w:r>
+              <w:rPr>
+                <w:rFonts w:ascii="Arial" w:cs="Arial" w:eastAsia="Arial" w:hAnsi="Arial"/>
+                <w:color w:val="1F2937"/>
+                <w:sz w:val="19"/>
+                <w:szCs w:val="19"/>
+              </w:rPr>
+              <w:t xml:space="preserve"/>
+            </w:r>
+          </w:p>
+        </w:tc>
+        <w:tc>
+          <w:tcPr>
+            <w:tcW w:type="dxa" w:w="5992"/>
+            <w:gridSpan w:val="5"/>
+            <w:tcBorders>
+              <w:top w:val="single" w:color="CBD5E1" w:sz="4"/>
+              <w:left w:val="single" w:color="CBD5E1" w:sz="4"/>
+              <w:bottom w:val="single" w:color="CBD5E1" w:sz="4"/>
+              <w:right w:val="single" w:color="CBD5E1" w:sz="4"/>
+            </w:tcBorders>
+            <w:shd w:fill="FDF5E6" w:color="auto" w:val="clear"/>
+            <w:tcMar>
+              <w:top w:type="dxa" w:w="70"/>
+              <w:left w:type="dxa" w:w="110"/>
+              <w:bottom w:type="dxa" w:w="70"/>
+              <w:right w:type="dxa" w:w="110"/>
+            </w:tcMar>
+            <w:vAlign w:val="center"/>
+          </w:tcPr>
+          <w:p>
+            <w:pPr>
+              <w:spacing w:after="20" w:before="0" w:line="264"/>
+              <w:jc w:val="center"/>
+            </w:pPr>
+            <w:r>
+              <w:rPr>
+                <w:rFonts w:ascii="Arial" w:cs="Arial" w:eastAsia="Arial" w:hAnsi="Arial"/>
+                <w:b/>
+                <w:bCs/>
+                <w:color w:val="1B2A44"/>
+                <w:sz w:val="16"/>
+                <w:szCs w:val="16"/>
+              </w:rPr>
+              <w:t xml:space="preserve">Discovery engine (ML)</w:t>
+            </w:r>
+          </w:p>
+          <w:p>
+            <w:pPr>
+              <w:spacing w:after="0" w:before="0" w:line="220"/>
+              <w:jc w:val="center"/>
+            </w:pPr>
+            <w:r>
+              <w:rPr>
+                <w:rFonts w:ascii="Arial" w:cs="Arial" w:eastAsia="Arial" w:hAnsi="Arial"/>
+                <w:color w:val="5B6472"/>
+                <w:sz w:val="14"/>
+                <w:szCs w:val="14"/>
+              </w:rPr>
+              <w:t xml:space="preserve">1 unsupervised → 2 classification → 3 rule finding</w:t>
+            </w:r>
+          </w:p>
+        </w:tc>
+      </w:tr>
+    </w:tbl>
+    <w:p>
+      <w:pPr>
+        <w:pStyle w:val="ListParagraph"/>
+        <w:keepLines/>
+        <w:numPr>
+          <w:ilvl w:val="0"/>
+          <w:numId w:val="2"/>
+        </w:numPr>
+        <w:spacing w:after="50" w:line="256"/>
+      </w:pPr>
+      <w:r>
+        <w:rPr>
+          <w:rFonts w:ascii="Arial" w:cs="Arial" w:eastAsia="Arial" w:hAnsi="Arial"/>
+          <w:b/>
+          <w:bCs/>
+          <w:color w:val="1F2937"/>
+          <w:sz w:val="19"/>
+          <w:szCs w:val="19"/>
+        </w:rPr>
+        <w:t xml:space="preserve">Common data lake: </w:t>
+      </w:r>
+      <w:r>
+        <w:rPr>
+          <w:rFonts w:ascii="Arial" w:cs="Arial" w:eastAsia="Arial" w:hAnsi="Arial"/>
+          <w:color w:val="1F2937"/>
+          <w:sz w:val="19"/>
+          <w:szCs w:val="19"/>
+        </w:rPr>
+        <w:t xml:space="preserve">read-only extracts from each department on a set frequency (daily or weekly), quality-checked on arrival and kept with full history in the State Data Centre.</w:t>
+      </w:r>
+    </w:p>
+    <w:p>
+      <w:pPr>
+        <w:pStyle w:val="ListParagraph"/>
+        <w:keepLines/>
+        <w:numPr>
+          <w:ilvl w:val="0"/>
+          <w:numId w:val="2"/>
+        </w:numPr>
+        <w:spacing w:after="50" w:line="256"/>
+      </w:pPr>
+      <w:r>
+        <w:rPr>
+          <w:rFonts w:ascii="Arial" w:cs="Arial" w:eastAsia="Arial" w:hAnsi="Arial"/>
+          <w:b/>
+          <w:bCs/>
+          <w:color w:val="1F2937"/>
+          <w:sz w:val="19"/>
+          <w:szCs w:val="19"/>
+        </w:rPr>
+        <w:t xml:space="preserve">Trino query engine: </w:t>
+      </w:r>
+      <w:r>
+        <w:rPr>
+          <w:rFonts w:ascii="Arial" w:cs="Arial" w:eastAsia="Arial" w:hAnsi="Arial"/>
+          <w:color w:val="1F2937"/>
+          <w:sz w:val="19"/>
+          <w:szCs w:val="19"/>
+        </w:rPr>
+        <w:t xml:space="preserve">a distributed SQL engine that runs every check across the lake at state scale and can also query a department's database directly where an extract is not yet possible.</w:t>
+      </w:r>
+    </w:p>
+    <w:p>
+      <w:pPr>
+        <w:pStyle w:val="ListParagraph"/>
+        <w:keepLines/>
+        <w:numPr>
+          <w:ilvl w:val="0"/>
+          <w:numId w:val="2"/>
+        </w:numPr>
+        <w:spacing w:after="50" w:line="256"/>
+      </w:pPr>
+      <w:r>
+        <w:rPr>
+          <w:rFonts w:ascii="Arial" w:cs="Arial" w:eastAsia="Arial" w:hAnsi="Arial"/>
+          <w:b/>
+          <w:bCs/>
+          <w:color w:val="1F2937"/>
+          <w:sz w:val="19"/>
+          <w:szCs w:val="19"/>
+        </w:rPr>
+        <w:t xml:space="preserve">Detection engine: </w:t>
+      </w:r>
+      <w:r>
+        <w:rPr>
+          <w:rFonts w:ascii="Arial" w:cs="Arial" w:eastAsia="Arial" w:hAnsi="Arial"/>
+          <w:color w:val="1F2937"/>
+          <w:sz w:val="19"/>
+          <w:szCs w:val="19"/>
+        </w:rPr>
+        <w:t xml:space="preserve">the rulebook of checks, the money engine that computes each rupee once with its derivation and grade, and the entity resolution that links records for the same taxpayer (PAN, GSTIN, or name, address and mobile where no shared key exists).</w:t>
       </w:r>
     </w:p>
     <w:p>
@@ -4852,7 +5679,7 @@
           <w:sz w:val="20"/>
           <w:szCs w:val="20"/>
         </w:rPr>
-        <w:t xml:space="preserve">Check families, adapted to Jharkhand's registers</w:t>
+        <w:t xml:space="preserve">Detection engine: check families adapted to Jharkhand's registers</w:t>
       </w:r>
     </w:p>
     <w:tbl>
@@ -6014,7 +6841,497 @@
     </w:p>
     <w:p>
       <w:pPr>
-        <w:spacing w:after="40" w:before="0" w:line="264"/>
+        <w:spacing w:after="0" w:before="0" w:line="20"/>
+      </w:pPr>
+      <w:r>
+        <w:br w:type="page"/>
+      </w:r>
+    </w:p>
+    <w:p>
+      <w:pPr>
+        <w:keepNext/>
+        <w:spacing w:after="100" w:before="240"/>
+      </w:pPr>
+      <w:r>
+        <w:rPr>
+          <w:rFonts w:ascii="Arial" w:cs="Arial" w:eastAsia="Arial" w:hAnsi="Arial"/>
+          <w:b/>
+          <w:bCs/>
+          <w:color w:val="0E7C7B"/>
+          <w:sz w:val="28"/>
+          <w:szCs w:val="28"/>
+        </w:rPr>
+        <w:t xml:space="preserve">4  </w:t>
+      </w:r>
+      <w:r>
+        <w:rPr>
+          <w:rFonts w:ascii="Arial" w:cs="Arial" w:eastAsia="Arial" w:hAnsi="Arial"/>
+          <w:b/>
+          <w:bCs/>
+          <w:color w:val="1B2A44"/>
+          <w:sz w:val="28"/>
+          <w:szCs w:val="28"/>
+        </w:rPr>
+        <w:t xml:space="preserve">THE DISCOVERY ENGINE: FINDING THE RULES NO ONE HAS WRITTEN YET</w:t>
+      </w:r>
+    </w:p>
+    <w:p>
+      <w:pPr>
+        <w:spacing w:after="80" w:before="0" w:line="264"/>
+        <w:jc w:val="both"/>
+      </w:pPr>
+      <w:r>
+        <w:rPr>
+          <w:rFonts w:ascii="Arial" w:cs="Arial" w:eastAsia="Arial" w:hAnsi="Arial"/>
+          <w:color w:val="1F2937"/>
+          <w:sz w:val="19"/>
+          <w:szCs w:val="19"/>
+        </w:rPr>
+        <w:t xml:space="preserve">The detection engine finds what its rules describe. Leakage also takes forms no rule yet describes. The discovery engine uses three layers of machine learning over the common data lake to find those forms and turn them into rules that the detection engine can then run every day.</w:t>
+      </w:r>
+    </w:p>
+    <w:tbl>
+      <w:tblPr>
+        <w:tblW w:type="dxa" w:w="10206"/>
+        <w:tblBorders>
+          <w:top w:val="single" w:color="auto" w:sz="4"/>
+          <w:left w:val="single" w:color="auto" w:sz="4"/>
+          <w:bottom w:val="single" w:color="auto" w:sz="4"/>
+          <w:right w:val="single" w:color="auto" w:sz="4"/>
+          <w:insideH w:val="single" w:color="auto" w:sz="4"/>
+          <w:insideV w:val="single" w:color="auto" w:sz="4"/>
+        </w:tblBorders>
+        <w:tblLayout w:type="fixed"/>
+      </w:tblPr>
+      <w:tblGrid>
+        <w:gridCol w:w="1900"/>
+        <w:gridCol w:w="3900"/>
+        <w:gridCol w:w="4406"/>
+      </w:tblGrid>
+      <w:tr>
+        <w:trPr>
+          <w:cantSplit/>
+          <w:tblHeader/>
+        </w:trPr>
+        <w:tc>
+          <w:tcPr>
+            <w:tcW w:type="dxa" w:w="1900"/>
+            <w:tcBorders>
+              <w:top w:val="single" w:color="CBD5E1" w:sz="4"/>
+              <w:left w:val="single" w:color="CBD5E1" w:sz="4"/>
+              <w:bottom w:val="single" w:color="CBD5E1" w:sz="4"/>
+              <w:right w:val="single" w:color="CBD5E1" w:sz="4"/>
+            </w:tcBorders>
+            <w:shd w:fill="1B2A44" w:color="auto" w:val="clear"/>
+            <w:tcMar>
+              <w:top w:type="dxa" w:w="50"/>
+              <w:left w:type="dxa" w:w="110"/>
+              <w:bottom w:type="dxa" w:w="50"/>
+              <w:right w:type="dxa" w:w="110"/>
+            </w:tcMar>
+            <w:vAlign w:val="top"/>
+          </w:tcPr>
+          <w:p>
+            <w:pPr>
+              <w:spacing w:after="0" w:before="0" w:line="264"/>
+            </w:pPr>
+            <w:r>
+              <w:rPr>
+                <w:rFonts w:ascii="Arial" w:cs="Arial" w:eastAsia="Arial" w:hAnsi="Arial"/>
+                <w:b/>
+                <w:bCs/>
+                <w:color w:val="FFFFFF"/>
+                <w:sz w:val="16"/>
+                <w:szCs w:val="16"/>
+              </w:rPr>
+              <w:t xml:space="preserve">Layer</w:t>
+            </w:r>
+          </w:p>
+        </w:tc>
+        <w:tc>
+          <w:tcPr>
+            <w:tcW w:type="dxa" w:w="3900"/>
+            <w:tcBorders>
+              <w:top w:val="single" w:color="CBD5E1" w:sz="4"/>
+              <w:left w:val="single" w:color="CBD5E1" w:sz="4"/>
+              <w:bottom w:val="single" w:color="CBD5E1" w:sz="4"/>
+              <w:right w:val="single" w:color="CBD5E1" w:sz="4"/>
+            </w:tcBorders>
+            <w:shd w:fill="1B2A44" w:color="auto" w:val="clear"/>
+            <w:tcMar>
+              <w:top w:type="dxa" w:w="50"/>
+              <w:left w:type="dxa" w:w="110"/>
+              <w:bottom w:type="dxa" w:w="50"/>
+              <w:right w:type="dxa" w:w="110"/>
+            </w:tcMar>
+            <w:vAlign w:val="top"/>
+          </w:tcPr>
+          <w:p>
+            <w:pPr>
+              <w:spacing w:after="0" w:before="0" w:line="264"/>
+            </w:pPr>
+            <w:r>
+              <w:rPr>
+                <w:rFonts w:ascii="Arial" w:cs="Arial" w:eastAsia="Arial" w:hAnsi="Arial"/>
+                <w:b/>
+                <w:bCs/>
+                <w:color w:val="FFFFFF"/>
+                <w:sz w:val="16"/>
+                <w:szCs w:val="16"/>
+              </w:rPr>
+              <w:t xml:space="preserve">What it does</w:t>
+            </w:r>
+          </w:p>
+        </w:tc>
+        <w:tc>
+          <w:tcPr>
+            <w:tcW w:type="dxa" w:w="4406"/>
+            <w:tcBorders>
+              <w:top w:val="single" w:color="CBD5E1" w:sz="4"/>
+              <w:left w:val="single" w:color="CBD5E1" w:sz="4"/>
+              <w:bottom w:val="single" w:color="CBD5E1" w:sz="4"/>
+              <w:right w:val="single" w:color="CBD5E1" w:sz="4"/>
+            </w:tcBorders>
+            <w:shd w:fill="1B2A44" w:color="auto" w:val="clear"/>
+            <w:tcMar>
+              <w:top w:type="dxa" w:w="50"/>
+              <w:left w:type="dxa" w:w="110"/>
+              <w:bottom w:type="dxa" w:w="50"/>
+              <w:right w:type="dxa" w:w="110"/>
+            </w:tcMar>
+            <w:vAlign w:val="top"/>
+          </w:tcPr>
+          <w:p>
+            <w:pPr>
+              <w:spacing w:after="0" w:before="0" w:line="264"/>
+            </w:pPr>
+            <w:r>
+              <w:rPr>
+                <w:rFonts w:ascii="Arial" w:cs="Arial" w:eastAsia="Arial" w:hAnsi="Arial"/>
+                <w:b/>
+                <w:bCs/>
+                <w:color w:val="FFFFFF"/>
+                <w:sz w:val="16"/>
+                <w:szCs w:val="16"/>
+              </w:rPr>
+              <w:t xml:space="preserve">What it produces</w:t>
+            </w:r>
+          </w:p>
+        </w:tc>
+      </w:tr>
+      <w:tr>
+        <w:trPr>
+          <w:cantSplit/>
+        </w:trPr>
+        <w:tc>
+          <w:tcPr>
+            <w:tcW w:type="dxa" w:w="1900"/>
+            <w:tcBorders>
+              <w:top w:val="single" w:color="CBD5E1" w:sz="4"/>
+              <w:left w:val="single" w:color="CBD5E1" w:sz="4"/>
+              <w:bottom w:val="single" w:color="CBD5E1" w:sz="4"/>
+              <w:right w:val="single" w:color="CBD5E1" w:sz="4"/>
+            </w:tcBorders>
+            <w:tcMar>
+              <w:top w:type="dxa" w:w="45"/>
+              <w:left w:type="dxa" w:w="110"/>
+              <w:bottom w:type="dxa" w:w="45"/>
+              <w:right w:type="dxa" w:w="110"/>
+            </w:tcMar>
+            <w:vAlign w:val="top"/>
+          </w:tcPr>
+          <w:p>
+            <w:pPr>
+              <w:spacing w:after="0" w:before="0" w:line="232"/>
+            </w:pPr>
+            <w:r>
+              <w:rPr>
+                <w:rFonts w:ascii="Arial" w:cs="Arial" w:eastAsia="Arial" w:hAnsi="Arial"/>
+                <w:b/>
+                <w:bCs/>
+                <w:color w:val="1B2A44"/>
+                <w:sz w:val="16"/>
+                <w:szCs w:val="16"/>
+              </w:rPr>
+              <w:t xml:space="preserve">1. Unsupervised discovery</w:t>
+            </w:r>
+          </w:p>
+        </w:tc>
+        <w:tc>
+          <w:tcPr>
+            <w:tcW w:type="dxa" w:w="3900"/>
+            <w:tcBorders>
+              <w:top w:val="single" w:color="CBD5E1" w:sz="4"/>
+              <w:left w:val="single" w:color="CBD5E1" w:sz="4"/>
+              <w:bottom w:val="single" w:color="CBD5E1" w:sz="4"/>
+              <w:right w:val="single" w:color="CBD5E1" w:sz="4"/>
+            </w:tcBorders>
+            <w:tcMar>
+              <w:top w:type="dxa" w:w="45"/>
+              <w:left w:type="dxa" w:w="110"/>
+              <w:bottom w:type="dxa" w:w="45"/>
+              <w:right w:type="dxa" w:w="110"/>
+            </w:tcMar>
+            <w:vAlign w:val="top"/>
+          </w:tcPr>
+          <w:p>
+            <w:pPr>
+              <w:spacing w:after="0" w:before="0" w:line="232"/>
+            </w:pPr>
+            <w:r>
+              <w:rPr>
+                <w:rFonts w:ascii="Arial" w:cs="Arial" w:eastAsia="Arial" w:hAnsi="Arial"/>
+                <w:color w:val="1F2937"/>
+                <w:sz w:val="16"/>
+                <w:szCs w:val="16"/>
+              </w:rPr>
+              <w:t xml:space="preserve">Looks across all departments' records for taxpayers and behaviour that stand apart from their peers (anomaly detection and clustering), with no prior labels.</w:t>
+            </w:r>
+          </w:p>
+        </w:tc>
+        <w:tc>
+          <w:tcPr>
+            <w:tcW w:type="dxa" w:w="4406"/>
+            <w:tcBorders>
+              <w:top w:val="single" w:color="CBD5E1" w:sz="4"/>
+              <w:left w:val="single" w:color="CBD5E1" w:sz="4"/>
+              <w:bottom w:val="single" w:color="CBD5E1" w:sz="4"/>
+              <w:right w:val="single" w:color="CBD5E1" w:sz="4"/>
+            </w:tcBorders>
+            <w:tcMar>
+              <w:top w:type="dxa" w:w="45"/>
+              <w:left w:type="dxa" w:w="110"/>
+              <w:bottom w:type="dxa" w:w="45"/>
+              <w:right w:type="dxa" w:w="110"/>
+            </w:tcMar>
+            <w:vAlign w:val="top"/>
+          </w:tcPr>
+          <w:p>
+            <w:pPr>
+              <w:spacing w:after="0" w:before="0" w:line="232"/>
+            </w:pPr>
+            <w:r>
+              <w:rPr>
+                <w:rFonts w:ascii="Arial" w:cs="Arial" w:eastAsia="Arial" w:hAnsi="Arial"/>
+                <w:color w:val="1F2937"/>
+                <w:sz w:val="16"/>
+                <w:szCs w:val="16"/>
+              </w:rPr>
+              <w:t xml:space="preserve">Groups of unusual taxpayers and the features that set them apart</w:t>
+            </w:r>
+          </w:p>
+        </w:tc>
+      </w:tr>
+      <w:tr>
+        <w:trPr>
+          <w:cantSplit/>
+        </w:trPr>
+        <w:tc>
+          <w:tcPr>
+            <w:tcW w:type="dxa" w:w="1900"/>
+            <w:tcBorders>
+              <w:top w:val="single" w:color="CBD5E1" w:sz="4"/>
+              <w:left w:val="single" w:color="CBD5E1" w:sz="4"/>
+              <w:bottom w:val="single" w:color="CBD5E1" w:sz="4"/>
+              <w:right w:val="single" w:color="CBD5E1" w:sz="4"/>
+            </w:tcBorders>
+            <w:tcMar>
+              <w:top w:type="dxa" w:w="45"/>
+              <w:left w:type="dxa" w:w="110"/>
+              <w:bottom w:type="dxa" w:w="45"/>
+              <w:right w:type="dxa" w:w="110"/>
+            </w:tcMar>
+            <w:vAlign w:val="top"/>
+          </w:tcPr>
+          <w:p>
+            <w:pPr>
+              <w:spacing w:after="0" w:before="0" w:line="232"/>
+            </w:pPr>
+            <w:r>
+              <w:rPr>
+                <w:rFonts w:ascii="Arial" w:cs="Arial" w:eastAsia="Arial" w:hAnsi="Arial"/>
+                <w:b/>
+                <w:bCs/>
+                <w:color w:val="1B2A44"/>
+                <w:sz w:val="16"/>
+                <w:szCs w:val="16"/>
+              </w:rPr>
+              <w:t xml:space="preserve">2. Classification</w:t>
+            </w:r>
+          </w:p>
+        </w:tc>
+        <w:tc>
+          <w:tcPr>
+            <w:tcW w:type="dxa" w:w="3900"/>
+            <w:tcBorders>
+              <w:top w:val="single" w:color="CBD5E1" w:sz="4"/>
+              <w:left w:val="single" w:color="CBD5E1" w:sz="4"/>
+              <w:bottom w:val="single" w:color="CBD5E1" w:sz="4"/>
+              <w:right w:val="single" w:color="CBD5E1" w:sz="4"/>
+            </w:tcBorders>
+            <w:tcMar>
+              <w:top w:type="dxa" w:w="45"/>
+              <w:left w:type="dxa" w:w="110"/>
+              <w:bottom w:type="dxa" w:w="45"/>
+              <w:right w:type="dxa" w:w="110"/>
+            </w:tcMar>
+            <w:vAlign w:val="top"/>
+          </w:tcPr>
+          <w:p>
+            <w:pPr>
+              <w:spacing w:after="0" w:before="0" w:line="232"/>
+            </w:pPr>
+            <w:r>
+              <w:rPr>
+                <w:rFonts w:ascii="Arial" w:cs="Arial" w:eastAsia="Arial" w:hAnsi="Arial"/>
+                <w:color w:val="1F2937"/>
+                <w:sz w:val="16"/>
+                <w:szCs w:val="16"/>
+              </w:rPr>
+              <w:t xml:space="preserve">Learns from officers' verified outcomes (confirmed leakage or a legitimate explanation) which unusual patterns are real, and scores new cases accordingly.</w:t>
+            </w:r>
+          </w:p>
+        </w:tc>
+        <w:tc>
+          <w:tcPr>
+            <w:tcW w:type="dxa" w:w="4406"/>
+            <w:tcBorders>
+              <w:top w:val="single" w:color="CBD5E1" w:sz="4"/>
+              <w:left w:val="single" w:color="CBD5E1" w:sz="4"/>
+              <w:bottom w:val="single" w:color="CBD5E1" w:sz="4"/>
+              <w:right w:val="single" w:color="CBD5E1" w:sz="4"/>
+            </w:tcBorders>
+            <w:tcMar>
+              <w:top w:type="dxa" w:w="45"/>
+              <w:left w:type="dxa" w:w="110"/>
+              <w:bottom w:type="dxa" w:w="45"/>
+              <w:right w:type="dxa" w:w="110"/>
+            </w:tcMar>
+            <w:vAlign w:val="top"/>
+          </w:tcPr>
+          <w:p>
+            <w:pPr>
+              <w:spacing w:after="0" w:before="0" w:line="232"/>
+            </w:pPr>
+            <w:r>
+              <w:rPr>
+                <w:rFonts w:ascii="Arial" w:cs="Arial" w:eastAsia="Arial" w:hAnsi="Arial"/>
+                <w:color w:val="1F2937"/>
+                <w:sz w:val="16"/>
+                <w:szCs w:val="16"/>
+              </w:rPr>
+              <w:t xml:space="preserve">Patterns ranked by how often they turn out to be genuine</w:t>
+            </w:r>
+          </w:p>
+        </w:tc>
+      </w:tr>
+      <w:tr>
+        <w:trPr>
+          <w:cantSplit/>
+        </w:trPr>
+        <w:tc>
+          <w:tcPr>
+            <w:tcW w:type="dxa" w:w="1900"/>
+            <w:tcBorders>
+              <w:top w:val="single" w:color="CBD5E1" w:sz="4"/>
+              <w:left w:val="single" w:color="CBD5E1" w:sz="4"/>
+              <w:bottom w:val="single" w:color="CBD5E1" w:sz="4"/>
+              <w:right w:val="single" w:color="CBD5E1" w:sz="4"/>
+            </w:tcBorders>
+            <w:tcMar>
+              <w:top w:type="dxa" w:w="45"/>
+              <w:left w:type="dxa" w:w="110"/>
+              <w:bottom w:type="dxa" w:w="45"/>
+              <w:right w:type="dxa" w:w="110"/>
+            </w:tcMar>
+            <w:vAlign w:val="top"/>
+          </w:tcPr>
+          <w:p>
+            <w:pPr>
+              <w:spacing w:after="0" w:before="0" w:line="232"/>
+            </w:pPr>
+            <w:r>
+              <w:rPr>
+                <w:rFonts w:ascii="Arial" w:cs="Arial" w:eastAsia="Arial" w:hAnsi="Arial"/>
+                <w:b/>
+                <w:bCs/>
+                <w:color w:val="1B2A44"/>
+                <w:sz w:val="16"/>
+                <w:szCs w:val="16"/>
+              </w:rPr>
+              <w:t xml:space="preserve">3. Rule finding</w:t>
+            </w:r>
+          </w:p>
+        </w:tc>
+        <w:tc>
+          <w:tcPr>
+            <w:tcW w:type="dxa" w:w="3900"/>
+            <w:tcBorders>
+              <w:top w:val="single" w:color="CBD5E1" w:sz="4"/>
+              <w:left w:val="single" w:color="CBD5E1" w:sz="4"/>
+              <w:bottom w:val="single" w:color="CBD5E1" w:sz="4"/>
+              <w:right w:val="single" w:color="CBD5E1" w:sz="4"/>
+            </w:tcBorders>
+            <w:tcMar>
+              <w:top w:type="dxa" w:w="45"/>
+              <w:left w:type="dxa" w:w="110"/>
+              <w:bottom w:type="dxa" w:w="45"/>
+              <w:right w:type="dxa" w:w="110"/>
+            </w:tcMar>
+            <w:vAlign w:val="top"/>
+          </w:tcPr>
+          <w:p>
+            <w:pPr>
+              <w:spacing w:after="0" w:before="0" w:line="232"/>
+            </w:pPr>
+            <w:r>
+              <w:rPr>
+                <w:rFonts w:ascii="Arial" w:cs="Arial" w:eastAsia="Arial" w:hAnsi="Arial"/>
+                <w:color w:val="1F2937"/>
+                <w:sz w:val="16"/>
+                <w:szCs w:val="16"/>
+              </w:rPr>
+              <w:t xml:space="preserve">Turns each confirmed pattern into a short, explainable rule: plain conditions on the taxpayer's records with clear thresholds.</w:t>
+            </w:r>
+          </w:p>
+        </w:tc>
+        <w:tc>
+          <w:tcPr>
+            <w:tcW w:type="dxa" w:w="4406"/>
+            <w:tcBorders>
+              <w:top w:val="single" w:color="CBD5E1" w:sz="4"/>
+              <w:left w:val="single" w:color="CBD5E1" w:sz="4"/>
+              <w:bottom w:val="single" w:color="CBD5E1" w:sz="4"/>
+              <w:right w:val="single" w:color="CBD5E1" w:sz="4"/>
+            </w:tcBorders>
+            <w:tcMar>
+              <w:top w:type="dxa" w:w="45"/>
+              <w:left w:type="dxa" w:w="110"/>
+              <w:bottom w:type="dxa" w:w="45"/>
+              <w:right w:type="dxa" w:w="110"/>
+            </w:tcMar>
+            <w:vAlign w:val="top"/>
+          </w:tcPr>
+          <w:p>
+            <w:pPr>
+              <w:spacing w:after="0" w:before="0" w:line="232"/>
+            </w:pPr>
+            <w:r>
+              <w:rPr>
+                <w:rFonts w:ascii="Arial" w:cs="Arial" w:eastAsia="Arial" w:hAnsi="Arial"/>
+                <w:color w:val="1F2937"/>
+                <w:sz w:val="16"/>
+                <w:szCs w:val="16"/>
+              </w:rPr>
+              <w:t xml:space="preserve">Candidate rules in the same form as the rulebook</w:t>
+            </w:r>
+          </w:p>
+        </w:tc>
+      </w:tr>
+    </w:tbl>
+    <w:p>
+      <w:pPr>
+        <w:spacing w:after="60" w:before="0" w:line="264"/>
       </w:pPr>
       <w:r>
         <w:rPr>
@@ -6051,11 +7368,11 @@
             <w:tcW w:type="dxa" w:w="10206"/>
             <w:tcBorders>
               <w:top w:val="none" w:color="FFFFFF" w:sz="0"/>
-              <w:left w:val="single" w:color="B7791F" w:sz="24"/>
+              <w:left w:val="single" w:color="0E7C7B" w:sz="24"/>
               <w:bottom w:val="none" w:color="FFFFFF" w:sz="0"/>
               <w:right w:val="none" w:color="FFFFFF" w:sz="0"/>
             </w:tcBorders>
-            <w:shd w:fill="FDF5E6" w:color="auto" w:val="clear"/>
+            <w:shd w:fill="E6F4F3" w:color="auto" w:val="clear"/>
             <w:tcMar>
               <w:top w:type="dxa" w:w="110"/>
               <w:left w:type="dxa" w:w="110"/>
@@ -6073,11 +7390,11 @@
                 <w:rFonts w:ascii="Arial" w:cs="Arial" w:eastAsia="Arial" w:hAnsi="Arial"/>
                 <w:b/>
                 <w:bCs/>
-                <w:color w:val="B7791F"/>
+                <w:color w:val="0E7C7B"/>
                 <w:sz w:val="17"/>
                 <w:szCs w:val="17"/>
               </w:rPr>
-              <w:t xml:space="preserve">SAFEGUARDS BUILT IN</w:t>
+              <w:t xml:space="preserve">FROM A PATTERN TO A RULE</w:t>
             </w:r>
           </w:p>
           <w:p>
@@ -6097,7 +7414,7 @@
                 <w:sz w:val="19"/>
                 <w:szCs w:val="19"/>
               </w:rPr>
-              <w:t xml:space="preserve">A discrepancy is not an evasion. The output is a verification list; nothing is assessed, billed or demanded by the platform.</w:t>
+              <w:t xml:space="preserve">Each candidate rule is back-tested on historical records and reviewed by departmental officers and our domain team.</w:t>
             </w:r>
           </w:p>
           <w:p>
@@ -6117,7 +7434,7 @@
                 <w:sz w:val="19"/>
                 <w:szCs w:val="19"/>
               </w:rPr>
-              <w:t xml:space="preserve">Evidence (both records are the state's own, keyed to the same taxpayer) is kept apart from leads (patterns and benchmarks), and a lead is never promoted to evidence automatically.</w:t>
+              <w:t xml:space="preserve">Only approved rules enter the detection engine, each with a statutory basis, a grade and an evidence or lead ceiling like every other rule.</w:t>
             </w:r>
           </w:p>
           <w:p>
@@ -6137,7 +7454,7 @@
                 <w:sz w:val="19"/>
                 <w:szCs w:val="19"/>
               </w:rPr>
-              <w:t xml:space="preserve">Every statutory rate sits in one table that the department signs off; no rupee is computed from an unsigned rate.</w:t>
+              <w:t xml:space="preserve">The ML never raises a case against a taxpayer directly; every case an officer acts on comes from a rule that can be explained in terms of the taxpayer's own records.</w:t>
             </w:r>
           </w:p>
           <w:p>
@@ -6157,13 +7474,167 @@
                 <w:sz w:val="19"/>
                 <w:szCs w:val="19"/>
               </w:rPr>
-              <w:t xml:space="preserve">Read-only access, role-based permissions, audit logs, hosting in the State Data Centre, DPDP Act 2023 compliant.</w:t>
+              <w:t xml:space="preserve">The engine learns from verified outcomes, so it starts after the pilot has produced them and improves with every monthly cycle.</w:t>
             </w:r>
           </w:p>
         </w:tc>
       </w:tr>
     </w:tbl>
     <w:p>
+      <w:pPr>
+        <w:spacing w:after="100" w:before="0" w:line="264"/>
+      </w:pPr>
+      <w:r>
+        <w:rPr>
+          <w:rFonts w:ascii="Arial" w:cs="Arial" w:eastAsia="Arial" w:hAnsi="Arial"/>
+          <w:color w:val="1F2937"/>
+          <w:sz w:val="19"/>
+          <w:szCs w:val="19"/>
+        </w:rPr>
+        <w:t xml:space="preserve"/>
+      </w:r>
+    </w:p>
+    <w:tbl>
+      <w:tblPr>
+        <w:tblW w:type="dxa" w:w="10206"/>
+        <w:tblBorders>
+          <w:top w:val="single" w:color="auto" w:sz="4"/>
+          <w:left w:val="single" w:color="auto" w:sz="4"/>
+          <w:bottom w:val="single" w:color="auto" w:sz="4"/>
+          <w:right w:val="single" w:color="auto" w:sz="4"/>
+          <w:insideH w:val="single" w:color="auto" w:sz="4"/>
+          <w:insideV w:val="single" w:color="auto" w:sz="4"/>
+        </w:tblBorders>
+        <w:tblLayout w:type="fixed"/>
+      </w:tblPr>
+      <w:tblGrid>
+        <w:gridCol w:w="10206"/>
+      </w:tblGrid>
+      <w:tr>
+        <w:trPr>
+          <w:cantSplit/>
+        </w:trPr>
+        <w:tc>
+          <w:tcPr>
+            <w:tcW w:type="dxa" w:w="10206"/>
+            <w:tcBorders>
+              <w:top w:val="none" w:color="FFFFFF" w:sz="0"/>
+              <w:left w:val="single" w:color="B7791F" w:sz="24"/>
+              <w:bottom w:val="none" w:color="FFFFFF" w:sz="0"/>
+              <w:right w:val="none" w:color="FFFFFF" w:sz="0"/>
+            </w:tcBorders>
+            <w:shd w:fill="FDF5E6" w:color="auto" w:val="clear"/>
+            <w:tcMar>
+              <w:top w:type="dxa" w:w="110"/>
+              <w:left w:type="dxa" w:w="110"/>
+              <w:bottom w:type="dxa" w:w="110"/>
+              <w:right w:type="dxa" w:w="110"/>
+            </w:tcMar>
+            <w:vAlign w:val="top"/>
+          </w:tcPr>
+          <w:p>
+            <w:pPr>
+              <w:spacing w:after="40" w:before="0" w:line="264"/>
+            </w:pPr>
+            <w:r>
+              <w:rPr>
+                <w:rFonts w:ascii="Arial" w:cs="Arial" w:eastAsia="Arial" w:hAnsi="Arial"/>
+                <w:b/>
+                <w:bCs/>
+                <w:color w:val="B7791F"/>
+                <w:sz w:val="17"/>
+                <w:szCs w:val="17"/>
+              </w:rPr>
+              <w:t xml:space="preserve">SAFEGUARDS BUILT IN</w:t>
+            </w:r>
+          </w:p>
+          <w:p>
+            <w:pPr>
+              <w:pStyle w:val="ListParagraph"/>
+              <w:keepLines/>
+              <w:numPr>
+                <w:ilvl w:val="0"/>
+                <w:numId w:val="2"/>
+              </w:numPr>
+              <w:spacing w:after="50" w:line="256"/>
+            </w:pPr>
+            <w:r>
+              <w:rPr>
+                <w:rFonts w:ascii="Arial" w:cs="Arial" w:eastAsia="Arial" w:hAnsi="Arial"/>
+                <w:color w:val="1F2937"/>
+                <w:sz w:val="19"/>
+                <w:szCs w:val="19"/>
+              </w:rPr>
+              <w:t xml:space="preserve">A discrepancy is not an evasion. The output is a verification list; nothing is assessed, billed or demanded by the platform.</w:t>
+            </w:r>
+          </w:p>
+          <w:p>
+            <w:pPr>
+              <w:pStyle w:val="ListParagraph"/>
+              <w:keepLines/>
+              <w:numPr>
+                <w:ilvl w:val="0"/>
+                <w:numId w:val="2"/>
+              </w:numPr>
+              <w:spacing w:after="50" w:line="256"/>
+            </w:pPr>
+            <w:r>
+              <w:rPr>
+                <w:rFonts w:ascii="Arial" w:cs="Arial" w:eastAsia="Arial" w:hAnsi="Arial"/>
+                <w:color w:val="1F2937"/>
+                <w:sz w:val="19"/>
+                <w:szCs w:val="19"/>
+              </w:rPr>
+              <w:t xml:space="preserve">Evidence (both records are the state's own, keyed to the same taxpayer) is kept apart from leads (patterns and benchmarks), and a lead is never promoted to evidence automatically.</w:t>
+            </w:r>
+          </w:p>
+          <w:p>
+            <w:pPr>
+              <w:pStyle w:val="ListParagraph"/>
+              <w:keepLines/>
+              <w:numPr>
+                <w:ilvl w:val="0"/>
+                <w:numId w:val="2"/>
+              </w:numPr>
+              <w:spacing w:after="50" w:line="256"/>
+            </w:pPr>
+            <w:r>
+              <w:rPr>
+                <w:rFonts w:ascii="Arial" w:cs="Arial" w:eastAsia="Arial" w:hAnsi="Arial"/>
+                <w:color w:val="1F2937"/>
+                <w:sz w:val="19"/>
+                <w:szCs w:val="19"/>
+              </w:rPr>
+              <w:t xml:space="preserve">Every statutory rate sits in one table that the department signs off; no rupee is computed from an unsigned rate.</w:t>
+            </w:r>
+          </w:p>
+          <w:p>
+            <w:pPr>
+              <w:pStyle w:val="ListParagraph"/>
+              <w:keepLines/>
+              <w:numPr>
+                <w:ilvl w:val="0"/>
+                <w:numId w:val="2"/>
+              </w:numPr>
+              <w:spacing w:after="50" w:line="256"/>
+            </w:pPr>
+            <w:r>
+              <w:rPr>
+                <w:rFonts w:ascii="Arial" w:cs="Arial" w:eastAsia="Arial" w:hAnsi="Arial"/>
+                <w:color w:val="1F2937"/>
+                <w:sz w:val="19"/>
+                <w:szCs w:val="19"/>
+              </w:rPr>
+              <w:t xml:space="preserve">Read-only access, role-based permissions, audit logs, hosting in the State Data Centre, DPDP Act 2023 compliant.</w:t>
+            </w:r>
+          </w:p>
+        </w:tc>
+      </w:tr>
+    </w:tbl>
+    <w:p>
+      <w:pPr>
+        <w:spacing w:after="0" w:before="0" w:line="20"/>
+      </w:pPr>
       <w:r>
         <w:br w:type="page"/>
       </w:r>
@@ -6182,7 +7653,7 @@
           <w:sz w:val="28"/>
           <w:szCs w:val="28"/>
         </w:rPr>
-        <w:t xml:space="preserve">4  </w:t>
+        <w:t xml:space="preserve">5  </w:t>
       </w:r>
       <w:r>
         <w:rPr>
@@ -6665,7 +8136,7 @@
           <w:sz w:val="28"/>
           <w:szCs w:val="28"/>
         </w:rPr>
-        <w:t xml:space="preserve">5  </w:t>
+        <w:t xml:space="preserve">6  </w:t>
       </w:r>
       <w:r>
         <w:rPr>
@@ -6691,7 +8162,7 @@
           <w:sz w:val="19"/>
           <w:szCs w:val="19"/>
         </w:rPr>
-        <w:t xml:space="preserve">TrueYield is already built. The work is to adapt its rules and rates to Jharkhand's statutes, connect it to the departments' registers, and prove its value on real records before any statewide commitment.</w:t>
+        <w:t xml:space="preserve">The detection engine already exists. The work is to license and adapt it to Jharkhand's statutes, build the state-scale data platform, prove its value on real records, and then add the discovery engine once verified outcomes are available to learn from.</w:t>
       </w:r>
     </w:p>
     <w:tbl>
@@ -7092,7 +8563,7 @@
                 <w:sz w:val="16"/>
                 <w:szCs w:val="16"/>
               </w:rPr>
-              <w:t xml:space="preserve">Adapt checks to Jharkhand law; connect the three departments; run in three districts (proposed: Ranchi, Dhanbad, East Singhbhum); officers verify the top cases in the field.</w:t>
+              <w:t xml:space="preserve">Set up the data lake and Trino in the State Data Centre; scheduled ingestion from the three departments; adapt checks to Jharkhand law; run in three districts (proposed: Ranchi, Dhanbad, East Singhbhum); officers verify the top cases.</w:t>
             </w:r>
           </w:p>
         </w:tc>
@@ -7124,7 +8595,7 @@
                 <w:sz w:val="16"/>
                 <w:szCs w:val="16"/>
               </w:rPr>
-              <w:t xml:space="preserve">Verified findings, measured hit rate, recovery pipeline</w:t>
+              <w:t xml:space="preserve">Verified findings, measured hit rate, labelled outcomes</w:t>
             </w:r>
           </w:p>
         </w:tc>
@@ -7362,7 +8833,7 @@
                 <w:sz w:val="16"/>
                 <w:szCs w:val="16"/>
               </w:rPr>
-              <w:t xml:space="preserve">Add Transport, Excise, JBVNL and land records; all 24 districts; officer training; security audit; leadership dashboard.</w:t>
+              <w:t xml:space="preserve">Connect Transport, Excise, JBVNL and land records; all 24 districts; officer training; security audit; leadership dashboard.</w:t>
             </w:r>
           </w:p>
         </w:tc>
@@ -7433,6 +8904,141 @@
                 <w:sz w:val="16"/>
                 <w:szCs w:val="16"/>
               </w:rPr>
+              <w:t xml:space="preserve">2a. Discovery</w:t>
+            </w:r>
+          </w:p>
+        </w:tc>
+        <w:tc>
+          <w:tcPr>
+            <w:tcW w:type="dxa" w:w="1300"/>
+            <w:tcBorders>
+              <w:top w:val="single" w:color="CBD5E1" w:sz="4"/>
+              <w:left w:val="single" w:color="CBD5E1" w:sz="4"/>
+              <w:bottom w:val="single" w:color="CBD5E1" w:sz="4"/>
+              <w:right w:val="single" w:color="CBD5E1" w:sz="4"/>
+            </w:tcBorders>
+            <w:tcMar>
+              <w:top w:type="dxa" w:w="45"/>
+              <w:left w:type="dxa" w:w="110"/>
+              <w:bottom w:type="dxa" w:w="45"/>
+              <w:right w:type="dxa" w:w="110"/>
+            </w:tcMar>
+            <w:vAlign w:val="top"/>
+          </w:tcPr>
+          <w:p>
+            <w:pPr>
+              <w:spacing w:after="0" w:before="0" w:line="232"/>
+            </w:pPr>
+            <w:r>
+              <w:rPr>
+                <w:rFonts w:ascii="Arial" w:cs="Arial" w:eastAsia="Arial" w:hAnsi="Arial"/>
+                <w:color w:val="1F2937"/>
+                <w:sz w:val="16"/>
+                <w:szCs w:val="16"/>
+              </w:rPr>
+              <w:t xml:space="preserve">Months 2–6 of rollout</w:t>
+            </w:r>
+          </w:p>
+        </w:tc>
+        <w:tc>
+          <w:tcPr>
+            <w:tcW w:type="dxa" w:w="5006"/>
+            <w:tcBorders>
+              <w:top w:val="single" w:color="CBD5E1" w:sz="4"/>
+              <w:left w:val="single" w:color="CBD5E1" w:sz="4"/>
+              <w:bottom w:val="single" w:color="CBD5E1" w:sz="4"/>
+              <w:right w:val="single" w:color="CBD5E1" w:sz="4"/>
+            </w:tcBorders>
+            <w:tcMar>
+              <w:top w:type="dxa" w:w="45"/>
+              <w:left w:type="dxa" w:w="110"/>
+              <w:bottom w:type="dxa" w:w="45"/>
+              <w:right w:type="dxa" w:w="110"/>
+            </w:tcMar>
+            <w:vAlign w:val="top"/>
+          </w:tcPr>
+          <w:p>
+            <w:pPr>
+              <w:spacing w:after="0" w:before="0" w:line="232"/>
+            </w:pPr>
+            <w:r>
+              <w:rPr>
+                <w:rFonts w:ascii="Arial" w:cs="Arial" w:eastAsia="Arial" w:hAnsi="Arial"/>
+                <w:color w:val="1F2937"/>
+                <w:sz w:val="16"/>
+                <w:szCs w:val="16"/>
+              </w:rPr>
+              <w:t xml:space="preserve">Build the three ML layers on pilot outcomes; first candidate rules reviewed and added to the rulebook.</w:t>
+            </w:r>
+          </w:p>
+        </w:tc>
+        <w:tc>
+          <w:tcPr>
+            <w:tcW w:type="dxa" w:w="2200"/>
+            <w:tcBorders>
+              <w:top w:val="single" w:color="CBD5E1" w:sz="4"/>
+              <w:left w:val="single" w:color="CBD5E1" w:sz="4"/>
+              <w:bottom w:val="single" w:color="CBD5E1" w:sz="4"/>
+              <w:right w:val="single" w:color="CBD5E1" w:sz="4"/>
+            </w:tcBorders>
+            <w:tcMar>
+              <w:top w:type="dxa" w:w="45"/>
+              <w:left w:type="dxa" w:w="110"/>
+              <w:bottom w:type="dxa" w:w="45"/>
+              <w:right w:type="dxa" w:w="110"/>
+            </w:tcMar>
+            <w:vAlign w:val="top"/>
+          </w:tcPr>
+          <w:p>
+            <w:pPr>
+              <w:spacing w:after="0" w:before="0" w:line="232"/>
+            </w:pPr>
+            <w:r>
+              <w:rPr>
+                <w:rFonts w:ascii="Arial" w:cs="Arial" w:eastAsia="Arial" w:hAnsi="Arial"/>
+                <w:color w:val="1F2937"/>
+                <w:sz w:val="16"/>
+                <w:szCs w:val="16"/>
+              </w:rPr>
+              <w:t xml:space="preserve">Discovery engine; first new rules</w:t>
+            </w:r>
+          </w:p>
+        </w:tc>
+      </w:tr>
+      <w:tr>
+        <w:trPr>
+          <w:cantSplit/>
+        </w:trPr>
+        <w:tc>
+          <w:tcPr>
+            <w:tcW w:type="dxa" w:w="1700"/>
+            <w:tcBorders>
+              <w:top w:val="single" w:color="CBD5E1" w:sz="4"/>
+              <w:left w:val="single" w:color="CBD5E1" w:sz="4"/>
+              <w:bottom w:val="single" w:color="CBD5E1" w:sz="4"/>
+              <w:right w:val="single" w:color="CBD5E1" w:sz="4"/>
+            </w:tcBorders>
+            <w:tcMar>
+              <w:top w:type="dxa" w:w="45"/>
+              <w:left w:type="dxa" w:w="110"/>
+              <w:bottom w:type="dxa" w:w="45"/>
+              <w:right w:type="dxa" w:w="110"/>
+            </w:tcMar>
+            <w:vAlign w:val="top"/>
+          </w:tcPr>
+          <w:p>
+            <w:pPr>
+              <w:spacing w:after="0" w:before="0" w:line="232"/>
+            </w:pPr>
+            <w:r>
+              <w:rPr>
+                <w:rFonts w:ascii="Arial" w:cs="Arial" w:eastAsia="Arial" w:hAnsi="Arial"/>
+                <w:b/>
+                <w:bCs/>
+                <w:color w:val="1B2A44"/>
+                <w:sz w:val="16"/>
+                <w:szCs w:val="16"/>
+              </w:rPr>
               <w:t xml:space="preserve">3. Run</w:t>
             </w:r>
           </w:p>
@@ -7497,7 +9103,7 @@
                 <w:sz w:val="16"/>
                 <w:szCs w:val="16"/>
               </w:rPr>
-              <w:t xml:space="preserve">Rule and rate updates as notifications change; monthly findings and recovery report.</w:t>
+              <w:t xml:space="preserve">Scheduled ingestion; rule and rate updates; monthly discovery cycle and model retraining; monthly findings and recovery report.</w:t>
             </w:r>
           </w:p>
         </w:tc>
@@ -7529,7 +9135,7 @@
                 <w:sz w:val="16"/>
                 <w:szCs w:val="16"/>
               </w:rPr>
-              <w:t xml:space="preserve">Monthly recovery report</w:t>
+              <w:t xml:space="preserve">Monthly recovery report and new rules</w:t>
             </w:r>
           </w:p>
         </w:tc>
@@ -7562,6 +9168,9 @@
       </w:r>
     </w:p>
     <w:p>
+      <w:pPr>
+        <w:spacing w:after="0" w:before="0" w:line="20"/>
+      </w:pPr>
       <w:r>
         <w:br w:type="page"/>
       </w:r>
@@ -7580,7 +9189,7 @@
           <w:sz w:val="28"/>
           <w:szCs w:val="28"/>
         </w:rPr>
-        <w:t xml:space="preserve">6  </w:t>
+        <w:t xml:space="preserve">7  </w:t>
       </w:r>
       <w:r>
         <w:rPr>
@@ -7748,40 +9357,6 @@
               <w:t xml:space="preserve">Evidence for policy: what a rate or threshold change would yield</w:t>
             </w:r>
           </w:p>
-        </w:tc>
-        <w:tc>
-          <w:tcPr>
-            <w:tcW w:type="dxa" w:w="5103"/>
-            <w:tcBorders>
-              <w:top w:val="none" w:color="FFFFFF" w:sz="0"/>
-              <w:left w:val="none" w:color="FFFFFF" w:sz="0"/>
-              <w:bottom w:val="none" w:color="FFFFFF" w:sz="0"/>
-              <w:right w:val="none" w:color="FFFFFF" w:sz="0"/>
-            </w:tcBorders>
-            <w:tcMar>
-              <w:top w:type="dxa" w:w="60"/>
-              <w:left w:type="dxa" w:w="110"/>
-              <w:bottom w:type="dxa" w:w="60"/>
-              <w:right w:type="dxa" w:w="110"/>
-            </w:tcMar>
-            <w:vAlign w:val="top"/>
-          </w:tcPr>
-          <w:p>
-            <w:pPr>
-              <w:spacing w:after="40" w:before="0" w:line="264"/>
-            </w:pPr>
-            <w:r>
-              <w:rPr>
-                <w:rFonts w:ascii="Arial" w:cs="Arial" w:eastAsia="Arial" w:hAnsi="Arial"/>
-                <w:b/>
-                <w:bCs/>
-                <w:color w:val="0E7C7B"/>
-                <w:sz w:val="18"/>
-                <w:szCs w:val="18"/>
-              </w:rPr>
-              <w:t xml:space="preserve">For honest taxpayers and businesses</w:t>
-            </w:r>
-          </w:p>
           <w:p>
             <w:pPr>
               <w:pStyle w:val="ListParagraph"/>
@@ -7799,7 +9374,41 @@
                 <w:sz w:val="18"/>
                 <w:szCs w:val="18"/>
               </w:rPr>
-              <w:t xml:space="preserve">Fewer blanket inspections; scrutiny targeted at real discrepancies</w:t>
+              <w:t xml:space="preserve">A rulebook that keeps growing as the discovery engine finds new patterns</w:t>
+            </w:r>
+          </w:p>
+        </w:tc>
+        <w:tc>
+          <w:tcPr>
+            <w:tcW w:type="dxa" w:w="5103"/>
+            <w:tcBorders>
+              <w:top w:val="none" w:color="FFFFFF" w:sz="0"/>
+              <w:left w:val="none" w:color="FFFFFF" w:sz="0"/>
+              <w:bottom w:val="none" w:color="FFFFFF" w:sz="0"/>
+              <w:right w:val="none" w:color="FFFFFF" w:sz="0"/>
+            </w:tcBorders>
+            <w:tcMar>
+              <w:top w:type="dxa" w:w="60"/>
+              <w:left w:type="dxa" w:w="110"/>
+              <w:bottom w:type="dxa" w:w="60"/>
+              <w:right w:type="dxa" w:w="110"/>
+            </w:tcMar>
+            <w:vAlign w:val="top"/>
+          </w:tcPr>
+          <w:p>
+            <w:pPr>
+              <w:spacing w:after="40" w:before="0" w:line="264"/>
+            </w:pPr>
+            <w:r>
+              <w:rPr>
+                <w:rFonts w:ascii="Arial" w:cs="Arial" w:eastAsia="Arial" w:hAnsi="Arial"/>
+                <w:b/>
+                <w:bCs/>
+                <w:color w:val="0E7C7B"/>
+                <w:sz w:val="18"/>
+                <w:szCs w:val="18"/>
+              </w:rPr>
+              <w:t xml:space="preserve">For honest taxpayers and businesses</w:t>
             </w:r>
           </w:p>
           <w:p>
@@ -7819,7 +9428,7 @@
                 <w:sz w:val="18"/>
                 <w:szCs w:val="18"/>
               </w:rPr>
-              <w:t xml:space="preserve">A level playing field against under-reporting competitors</w:t>
+              <w:t xml:space="preserve">Fewer blanket inspections; scrutiny targeted at real discrepancies</w:t>
             </w:r>
           </w:p>
           <w:p>
@@ -7839,26 +9448,32 @@
                 <w:sz w:val="18"/>
                 <w:szCs w:val="18"/>
               </w:rPr>
+              <w:t xml:space="preserve">A level playing field against under-reporting competitors</w:t>
+            </w:r>
+          </w:p>
+          <w:p>
+            <w:pPr>
+              <w:pStyle w:val="ListParagraph"/>
+              <w:keepLines/>
+              <w:numPr>
+                <w:ilvl w:val="0"/>
+                <w:numId w:val="2"/>
+              </w:numPr>
+              <w:spacing w:after="50" w:line="256"/>
+            </w:pPr>
+            <w:r>
+              <w:rPr>
+                <w:rFonts w:ascii="Arial" w:cs="Arial" w:eastAsia="Arial" w:hAnsi="Arial"/>
+                <w:color w:val="1F2937"/>
+                <w:sz w:val="18"/>
+                <w:szCs w:val="18"/>
+              </w:rPr>
               <w:t xml:space="preserve">Clear, record-based reasons whenever a case is raised</w:t>
             </w:r>
           </w:p>
         </w:tc>
       </w:tr>
     </w:tbl>
-    <w:p>
-      <w:pPr>
-        <w:spacing w:after="40" w:before="0" w:line="264"/>
-      </w:pPr>
-      <w:r>
-        <w:rPr>
-          <w:rFonts w:ascii="Arial" w:cs="Arial" w:eastAsia="Arial" w:hAnsi="Arial"/>
-          <w:color w:val="1F2937"/>
-          <w:sz w:val="19"/>
-          <w:szCs w:val="19"/>
-        </w:rPr>
-        <w:t xml:space="preserve"/>
-      </w:r>
-    </w:p>
     <w:tbl>
       <w:tblPr>
         <w:tblW w:type="dxa" w:w="10206"/>
@@ -7925,7 +9540,7 @@
                 <w:sz w:val="19"/>
                 <w:szCs w:val="19"/>
               </w:rPr>
-              <w:t xml:space="preserve">If verified recoveries reached just 0.1% of own tax revenue (about ₹46 crore a year), that would be about fifty times the platform's full one-time cost of ₹68–92 lakh. How much leakage exists in Jharkhand today is not known by anyone; measuring it on real records is the purpose of the pilot.</w:t>
+              <w:t xml:space="preserve">If verified recoveries reached just 0.1% of own tax revenue (about ₹46 crore a year), that would be about thirty times the platform's full one-time cost of ₹1.14–1.52 cr. How much leakage exists in Jharkhand today is not known by anyone; measuring it on real records is the purpose of the pilot.</w:t>
             </w:r>
           </w:p>
         </w:tc>
@@ -7945,7 +9560,7 @@
           <w:sz w:val="28"/>
           <w:szCs w:val="28"/>
         </w:rPr>
-        <w:t xml:space="preserve">7  </w:t>
+        <w:t xml:space="preserve">8  </w:t>
       </w:r>
       <w:r>
         <w:rPr>
@@ -7973,9 +9588,10 @@
         <w:tblLayout w:type="fixed"/>
       </w:tblPr>
       <w:tblGrid>
-        <w:gridCol w:w="5806"/>
-        <w:gridCol w:w="2200"/>
-        <w:gridCol w:w="2200"/>
+        <w:gridCol w:w="4906"/>
+        <w:gridCol w:w="1750"/>
+        <w:gridCol w:w="1750"/>
+        <w:gridCol w:w="1800"/>
       </w:tblGrid>
       <w:tr>
         <w:trPr>
@@ -7984,7 +9600,7 @@
         </w:trPr>
         <w:tc>
           <w:tcPr>
-            <w:tcW w:type="dxa" w:w="5806"/>
+            <w:tcW w:type="dxa" w:w="4906"/>
             <w:tcBorders>
               <w:top w:val="single" w:color="CBD5E1" w:sz="4"/>
               <w:left w:val="single" w:color="CBD5E1" w:sz="4"/>
@@ -8013,13 +9629,13 @@
                 <w:sz w:val="16"/>
                 <w:szCs w:val="16"/>
               </w:rPr>
-              <w:t xml:space="preserve">Component</w:t>
-            </w:r>
-          </w:p>
-        </w:tc>
-        <w:tc>
-          <w:tcPr>
-            <w:tcW w:type="dxa" w:w="2200"/>
+              <w:t xml:space="preserve">One-time component</w:t>
+            </w:r>
+          </w:p>
+        </w:tc>
+        <w:tc>
+          <w:tcPr>
+            <w:tcW w:type="dxa" w:w="1750"/>
             <w:tcBorders>
               <w:top w:val="single" w:color="CBD5E1" w:sz="4"/>
               <w:left w:val="single" w:color="CBD5E1" w:sz="4"/>
@@ -8038,6 +9654,7 @@
           <w:p>
             <w:pPr>
               <w:spacing w:after="0" w:before="0" w:line="264"/>
+              <w:jc w:val="right"/>
             </w:pPr>
             <w:r>
               <w:rPr>
@@ -8048,13 +9665,13 @@
                 <w:sz w:val="16"/>
                 <w:szCs w:val="16"/>
               </w:rPr>
-              <w:t xml:space="preserve">Low</w:t>
-            </w:r>
-          </w:p>
-        </w:tc>
-        <w:tc>
-          <w:tcPr>
-            <w:tcW w:type="dxa" w:w="2200"/>
+              <w:t xml:space="preserve">Pilot</w:t>
+            </w:r>
+          </w:p>
+        </w:tc>
+        <w:tc>
+          <w:tcPr>
+            <w:tcW w:type="dxa" w:w="1750"/>
             <w:tcBorders>
               <w:top w:val="single" w:color="CBD5E1" w:sz="4"/>
               <w:left w:val="single" w:color="CBD5E1" w:sz="4"/>
@@ -8073,6 +9690,7 @@
           <w:p>
             <w:pPr>
               <w:spacing w:after="0" w:before="0" w:line="264"/>
+              <w:jc w:val="right"/>
             </w:pPr>
             <w:r>
               <w:rPr>
@@ -8083,7 +9701,43 @@
                 <w:sz w:val="16"/>
                 <w:szCs w:val="16"/>
               </w:rPr>
-              <w:t xml:space="preserve">High</w:t>
+              <w:t xml:space="preserve">Rollout</w:t>
+            </w:r>
+          </w:p>
+        </w:tc>
+        <w:tc>
+          <w:tcPr>
+            <w:tcW w:type="dxa" w:w="1800"/>
+            <w:tcBorders>
+              <w:top w:val="single" w:color="CBD5E1" w:sz="4"/>
+              <w:left w:val="single" w:color="CBD5E1" w:sz="4"/>
+              <w:bottom w:val="single" w:color="CBD5E1" w:sz="4"/>
+              <w:right w:val="single" w:color="CBD5E1" w:sz="4"/>
+            </w:tcBorders>
+            <w:shd w:fill="1B2A44" w:color="auto" w:val="clear"/>
+            <w:tcMar>
+              <w:top w:type="dxa" w:w="50"/>
+              <w:left w:type="dxa" w:w="110"/>
+              <w:bottom w:type="dxa" w:w="50"/>
+              <w:right w:type="dxa" w:w="110"/>
+            </w:tcMar>
+            <w:vAlign w:val="top"/>
+          </w:tcPr>
+          <w:p>
+            <w:pPr>
+              <w:spacing w:after="0" w:before="0" w:line="264"/>
+              <w:jc w:val="right"/>
+            </w:pPr>
+            <w:r>
+              <w:rPr>
+                <w:rFonts w:ascii="Arial" w:cs="Arial" w:eastAsia="Arial" w:hAnsi="Arial"/>
+                <w:b/>
+                <w:bCs/>
+                <w:color w:val="FFFFFF"/>
+                <w:sz w:val="16"/>
+                <w:szCs w:val="16"/>
+              </w:rPr>
+              <w:t xml:space="preserve">Total</w:t>
             </w:r>
           </w:p>
         </w:tc>
@@ -8094,17 +9748,49 @@
         </w:trPr>
         <w:tc>
           <w:tcPr>
-            <w:tcW w:type="dxa" w:w="5806"/>
-            <w:tcBorders>
-              <w:top w:val="single" w:color="CBD5E1" w:sz="4"/>
-              <w:left w:val="single" w:color="CBD5E1" w:sz="4"/>
-              <w:bottom w:val="single" w:color="CBD5E1" w:sz="4"/>
-              <w:right w:val="single" w:color="CBD5E1" w:sz="4"/>
-            </w:tcBorders>
-            <w:tcMar>
-              <w:top w:type="dxa" w:w="60"/>
-              <w:left w:type="dxa" w:w="110"/>
-              <w:bottom w:type="dxa" w:w="60"/>
+            <w:tcW w:type="dxa" w:w="4906"/>
+            <w:tcBorders>
+              <w:top w:val="single" w:color="CBD5E1" w:sz="4"/>
+              <w:left w:val="single" w:color="CBD5E1" w:sz="4"/>
+              <w:bottom w:val="single" w:color="CBD5E1" w:sz="4"/>
+              <w:right w:val="single" w:color="CBD5E1" w:sz="4"/>
+            </w:tcBorders>
+            <w:tcMar>
+              <w:top w:type="dxa" w:w="45"/>
+              <w:left w:type="dxa" w:w="110"/>
+              <w:bottom w:type="dxa" w:w="45"/>
+              <w:right w:type="dxa" w:w="110"/>
+            </w:tcMar>
+            <w:vAlign w:val="top"/>
+          </w:tcPr>
+          <w:p>
+            <w:pPr>
+              <w:spacing w:after="0" w:before="0" w:line="232"/>
+            </w:pPr>
+            <w:r>
+              <w:rPr>
+                <w:rFonts w:ascii="Arial" w:cs="Arial" w:eastAsia="Arial" w:hAnsi="Arial"/>
+                <w:color w:val="1F2937"/>
+                <w:sz w:val="16"/>
+                <w:szCs w:val="16"/>
+              </w:rPr>
+              <w:t xml:space="preserve">TrueYield platform licence: detection engine, 85-check library, console, assistant, policy simulator (existing product; perpetual, state-wide)</w:t>
+            </w:r>
+          </w:p>
+        </w:tc>
+        <w:tc>
+          <w:tcPr>
+            <w:tcW w:type="dxa" w:w="1750"/>
+            <w:tcBorders>
+              <w:top w:val="single" w:color="CBD5E1" w:sz="4"/>
+              <w:left w:val="single" w:color="CBD5E1" w:sz="4"/>
+              <w:bottom w:val="single" w:color="CBD5E1" w:sz="4"/>
+              <w:right w:val="single" w:color="CBD5E1" w:sz="4"/>
+            </w:tcBorders>
+            <w:tcMar>
+              <w:top w:type="dxa" w:w="45"/>
+              <w:left w:type="dxa" w:w="110"/>
+              <w:bottom w:type="dxa" w:w="45"/>
               <w:right w:type="dxa" w:w="110"/>
             </w:tcMar>
             <w:vAlign w:val="top"/>
@@ -8112,31 +9798,34 @@
           <w:p>
             <w:pPr>
               <w:spacing w:after="0" w:before="0" w:line="264"/>
-            </w:pPr>
-            <w:r>
-              <w:rPr>
-                <w:rFonts w:ascii="Arial" w:cs="Arial" w:eastAsia="Arial" w:hAnsi="Arial"/>
-                <w:color w:val="1F2937"/>
-                <w:sz w:val="17"/>
-                <w:szCs w:val="17"/>
-              </w:rPr>
-              <w:t xml:space="preserve">Pilot (Phases 0–1): adaptation to Jharkhand, 3 departments, 3 districts</w:t>
-            </w:r>
-          </w:p>
-        </w:tc>
-        <w:tc>
-          <w:tcPr>
-            <w:tcW w:type="dxa" w:w="2200"/>
-            <w:tcBorders>
-              <w:top w:val="single" w:color="CBD5E1" w:sz="4"/>
-              <w:left w:val="single" w:color="CBD5E1" w:sz="4"/>
-              <w:bottom w:val="single" w:color="CBD5E1" w:sz="4"/>
-              <w:right w:val="single" w:color="CBD5E1" w:sz="4"/>
-            </w:tcBorders>
-            <w:tcMar>
-              <w:top w:type="dxa" w:w="60"/>
-              <w:left w:type="dxa" w:w="110"/>
-              <w:bottom w:type="dxa" w:w="60"/>
+              <w:jc w:val="right"/>
+            </w:pPr>
+            <w:r>
+              <w:rPr>
+                <w:rFonts w:ascii="Arial" w:cs="Arial" w:eastAsia="Arial" w:hAnsi="Arial"/>
+                <w:b w:val="false"/>
+                <w:bCs w:val="false"/>
+                <w:color w:val="1F2937"/>
+                <w:sz w:val="16"/>
+                <w:szCs w:val="16"/>
+              </w:rPr>
+              <w:t xml:space="preserve">₹8–10 lakh</w:t>
+            </w:r>
+          </w:p>
+        </w:tc>
+        <w:tc>
+          <w:tcPr>
+            <w:tcW w:type="dxa" w:w="1750"/>
+            <w:tcBorders>
+              <w:top w:val="single" w:color="CBD5E1" w:sz="4"/>
+              <w:left w:val="single" w:color="CBD5E1" w:sz="4"/>
+              <w:bottom w:val="single" w:color="CBD5E1" w:sz="4"/>
+              <w:right w:val="single" w:color="CBD5E1" w:sz="4"/>
+            </w:tcBorders>
+            <w:tcMar>
+              <w:top w:type="dxa" w:w="45"/>
+              <w:left w:type="dxa" w:w="110"/>
+              <w:bottom w:type="dxa" w:w="45"/>
               <w:right w:type="dxa" w:w="110"/>
             </w:tcMar>
             <w:vAlign w:val="top"/>
@@ -8144,31 +9833,34 @@
           <w:p>
             <w:pPr>
               <w:spacing w:after="0" w:before="0" w:line="264"/>
-            </w:pPr>
-            <w:r>
-              <w:rPr>
-                <w:rFonts w:ascii="Arial" w:cs="Arial" w:eastAsia="Arial" w:hAnsi="Arial"/>
-                <w:color w:val="1F2937"/>
-                <w:sz w:val="17"/>
-                <w:szCs w:val="17"/>
-              </w:rPr>
-              <w:t xml:space="preserve">₹28 lakh</w:t>
-            </w:r>
-          </w:p>
-        </w:tc>
-        <w:tc>
-          <w:tcPr>
-            <w:tcW w:type="dxa" w:w="2200"/>
-            <w:tcBorders>
-              <w:top w:val="single" w:color="CBD5E1" w:sz="4"/>
-              <w:left w:val="single" w:color="CBD5E1" w:sz="4"/>
-              <w:bottom w:val="single" w:color="CBD5E1" w:sz="4"/>
-              <w:right w:val="single" w:color="CBD5E1" w:sz="4"/>
-            </w:tcBorders>
-            <w:tcMar>
-              <w:top w:type="dxa" w:w="60"/>
-              <w:left w:type="dxa" w:w="110"/>
-              <w:bottom w:type="dxa" w:w="60"/>
+              <w:jc w:val="right"/>
+            </w:pPr>
+            <w:r>
+              <w:rPr>
+                <w:rFonts w:ascii="Arial" w:cs="Arial" w:eastAsia="Arial" w:hAnsi="Arial"/>
+                <w:b w:val="false"/>
+                <w:bCs w:val="false"/>
+                <w:color w:val="1F2937"/>
+                <w:sz w:val="16"/>
+                <w:szCs w:val="16"/>
+              </w:rPr>
+              <w:t xml:space="preserve">₹22–30 lakh</w:t>
+            </w:r>
+          </w:p>
+        </w:tc>
+        <w:tc>
+          <w:tcPr>
+            <w:tcW w:type="dxa" w:w="1800"/>
+            <w:tcBorders>
+              <w:top w:val="single" w:color="CBD5E1" w:sz="4"/>
+              <w:left w:val="single" w:color="CBD5E1" w:sz="4"/>
+              <w:bottom w:val="single" w:color="CBD5E1" w:sz="4"/>
+              <w:right w:val="single" w:color="CBD5E1" w:sz="4"/>
+            </w:tcBorders>
+            <w:tcMar>
+              <w:top w:type="dxa" w:w="45"/>
+              <w:left w:type="dxa" w:w="110"/>
+              <w:bottom w:type="dxa" w:w="45"/>
               <w:right w:type="dxa" w:w="110"/>
             </w:tcMar>
             <w:vAlign w:val="top"/>
@@ -8176,15 +9868,18 @@
           <w:p>
             <w:pPr>
               <w:spacing w:after="0" w:before="0" w:line="264"/>
-            </w:pPr>
-            <w:r>
-              <w:rPr>
-                <w:rFonts w:ascii="Arial" w:cs="Arial" w:eastAsia="Arial" w:hAnsi="Arial"/>
-                <w:color w:val="1F2937"/>
-                <w:sz w:val="17"/>
-                <w:szCs w:val="17"/>
-              </w:rPr>
-              <w:t xml:space="preserve">₹38 lakh</w:t>
+              <w:jc w:val="right"/>
+            </w:pPr>
+            <w:r>
+              <w:rPr>
+                <w:rFonts w:ascii="Arial" w:cs="Arial" w:eastAsia="Arial" w:hAnsi="Arial"/>
+                <w:b/>
+                <w:bCs/>
+                <w:color w:val="1F2937"/>
+                <w:sz w:val="16"/>
+                <w:szCs w:val="16"/>
+              </w:rPr>
+              <w:t xml:space="preserve">₹30–40 lakh</w:t>
             </w:r>
           </w:p>
         </w:tc>
@@ -8195,17 +9890,49 @@
         </w:trPr>
         <w:tc>
           <w:tcPr>
-            <w:tcW w:type="dxa" w:w="5806"/>
-            <w:tcBorders>
-              <w:top w:val="single" w:color="CBD5E1" w:sz="4"/>
-              <w:left w:val="single" w:color="CBD5E1" w:sz="4"/>
-              <w:bottom w:val="single" w:color="CBD5E1" w:sz="4"/>
-              <w:right w:val="single" w:color="CBD5E1" w:sz="4"/>
-            </w:tcBorders>
-            <w:tcMar>
-              <w:top w:type="dxa" w:w="60"/>
-              <w:left w:type="dxa" w:w="110"/>
-              <w:bottom w:type="dxa" w:w="60"/>
+            <w:tcW w:type="dxa" w:w="4906"/>
+            <w:tcBorders>
+              <w:top w:val="single" w:color="CBD5E1" w:sz="4"/>
+              <w:left w:val="single" w:color="CBD5E1" w:sz="4"/>
+              <w:bottom w:val="single" w:color="CBD5E1" w:sz="4"/>
+              <w:right w:val="single" w:color="CBD5E1" w:sz="4"/>
+            </w:tcBorders>
+            <w:tcMar>
+              <w:top w:type="dxa" w:w="45"/>
+              <w:left w:type="dxa" w:w="110"/>
+              <w:bottom w:type="dxa" w:w="45"/>
+              <w:right w:type="dxa" w:w="110"/>
+            </w:tcMar>
+            <w:vAlign w:val="top"/>
+          </w:tcPr>
+          <w:p>
+            <w:pPr>
+              <w:spacing w:after="0" w:before="0" w:line="232"/>
+            </w:pPr>
+            <w:r>
+              <w:rPr>
+                <w:rFonts w:ascii="Arial" w:cs="Arial" w:eastAsia="Arial" w:hAnsi="Arial"/>
+                <w:color w:val="1F2937"/>
+                <w:sz w:val="16"/>
+                <w:szCs w:val="16"/>
+              </w:rPr>
+              <w:t xml:space="preserve">Data platform: common data lake, Trino query engine, scheduled ingestion, data-quality checks, department connectors</w:t>
+            </w:r>
+          </w:p>
+        </w:tc>
+        <w:tc>
+          <w:tcPr>
+            <w:tcW w:type="dxa" w:w="1750"/>
+            <w:tcBorders>
+              <w:top w:val="single" w:color="CBD5E1" w:sz="4"/>
+              <w:left w:val="single" w:color="CBD5E1" w:sz="4"/>
+              <w:bottom w:val="single" w:color="CBD5E1" w:sz="4"/>
+              <w:right w:val="single" w:color="CBD5E1" w:sz="4"/>
+            </w:tcBorders>
+            <w:tcMar>
+              <w:top w:type="dxa" w:w="45"/>
+              <w:left w:type="dxa" w:w="110"/>
+              <w:bottom w:type="dxa" w:w="45"/>
               <w:right w:type="dxa" w:w="110"/>
             </w:tcMar>
             <w:vAlign w:val="top"/>
@@ -8213,31 +9940,34 @@
           <w:p>
             <w:pPr>
               <w:spacing w:after="0" w:before="0" w:line="264"/>
-            </w:pPr>
-            <w:r>
-              <w:rPr>
-                <w:rFonts w:ascii="Arial" w:cs="Arial" w:eastAsia="Arial" w:hAnsi="Arial"/>
-                <w:color w:val="1F2937"/>
-                <w:sz w:val="17"/>
-                <w:szCs w:val="17"/>
-              </w:rPr>
-              <w:t xml:space="preserve">Statewide rollout (Phase 2): 4 more departments, 24 districts, training, security audit</w:t>
-            </w:r>
-          </w:p>
-        </w:tc>
-        <w:tc>
-          <w:tcPr>
-            <w:tcW w:type="dxa" w:w="2200"/>
-            <w:tcBorders>
-              <w:top w:val="single" w:color="CBD5E1" w:sz="4"/>
-              <w:left w:val="single" w:color="CBD5E1" w:sz="4"/>
-              <w:bottom w:val="single" w:color="CBD5E1" w:sz="4"/>
-              <w:right w:val="single" w:color="CBD5E1" w:sz="4"/>
-            </w:tcBorders>
-            <w:tcMar>
-              <w:top w:type="dxa" w:w="60"/>
-              <w:left w:type="dxa" w:w="110"/>
-              <w:bottom w:type="dxa" w:w="60"/>
+              <w:jc w:val="right"/>
+            </w:pPr>
+            <w:r>
+              <w:rPr>
+                <w:rFonts w:ascii="Arial" w:cs="Arial" w:eastAsia="Arial" w:hAnsi="Arial"/>
+                <w:b w:val="false"/>
+                <w:bCs w:val="false"/>
+                <w:color w:val="1F2937"/>
+                <w:sz w:val="16"/>
+                <w:szCs w:val="16"/>
+              </w:rPr>
+              <w:t xml:space="preserve">₹12–16 lakh</w:t>
+            </w:r>
+          </w:p>
+        </w:tc>
+        <w:tc>
+          <w:tcPr>
+            <w:tcW w:type="dxa" w:w="1750"/>
+            <w:tcBorders>
+              <w:top w:val="single" w:color="CBD5E1" w:sz="4"/>
+              <w:left w:val="single" w:color="CBD5E1" w:sz="4"/>
+              <w:bottom w:val="single" w:color="CBD5E1" w:sz="4"/>
+              <w:right w:val="single" w:color="CBD5E1" w:sz="4"/>
+            </w:tcBorders>
+            <w:tcMar>
+              <w:top w:type="dxa" w:w="45"/>
+              <w:left w:type="dxa" w:w="110"/>
+              <w:bottom w:type="dxa" w:w="45"/>
               <w:right w:type="dxa" w:w="110"/>
             </w:tcMar>
             <w:vAlign w:val="top"/>
@@ -8245,31 +9975,34 @@
           <w:p>
             <w:pPr>
               <w:spacing w:after="0" w:before="0" w:line="264"/>
-            </w:pPr>
-            <w:r>
-              <w:rPr>
-                <w:rFonts w:ascii="Arial" w:cs="Arial" w:eastAsia="Arial" w:hAnsi="Arial"/>
-                <w:color w:val="1F2937"/>
-                <w:sz w:val="17"/>
-                <w:szCs w:val="17"/>
-              </w:rPr>
-              <w:t xml:space="preserve">₹40 lakh</w:t>
-            </w:r>
-          </w:p>
-        </w:tc>
-        <w:tc>
-          <w:tcPr>
-            <w:tcW w:type="dxa" w:w="2200"/>
-            <w:tcBorders>
-              <w:top w:val="single" w:color="CBD5E1" w:sz="4"/>
-              <w:left w:val="single" w:color="CBD5E1" w:sz="4"/>
-              <w:bottom w:val="single" w:color="CBD5E1" w:sz="4"/>
-              <w:right w:val="single" w:color="CBD5E1" w:sz="4"/>
-            </w:tcBorders>
-            <w:tcMar>
-              <w:top w:type="dxa" w:w="60"/>
-              <w:left w:type="dxa" w:w="110"/>
-              <w:bottom w:type="dxa" w:w="60"/>
+              <w:jc w:val="right"/>
+            </w:pPr>
+            <w:r>
+              <w:rPr>
+                <w:rFonts w:ascii="Arial" w:cs="Arial" w:eastAsia="Arial" w:hAnsi="Arial"/>
+                <w:b w:val="false"/>
+                <w:bCs w:val="false"/>
+                <w:color w:val="1F2937"/>
+                <w:sz w:val="16"/>
+                <w:szCs w:val="16"/>
+              </w:rPr>
+              <w:t xml:space="preserve">₹14–18 lakh</w:t>
+            </w:r>
+          </w:p>
+        </w:tc>
+        <w:tc>
+          <w:tcPr>
+            <w:tcW w:type="dxa" w:w="1800"/>
+            <w:tcBorders>
+              <w:top w:val="single" w:color="CBD5E1" w:sz="4"/>
+              <w:left w:val="single" w:color="CBD5E1" w:sz="4"/>
+              <w:bottom w:val="single" w:color="CBD5E1" w:sz="4"/>
+              <w:right w:val="single" w:color="CBD5E1" w:sz="4"/>
+            </w:tcBorders>
+            <w:tcMar>
+              <w:top w:type="dxa" w:w="45"/>
+              <w:left w:type="dxa" w:w="110"/>
+              <w:bottom w:type="dxa" w:w="45"/>
               <w:right w:type="dxa" w:w="110"/>
             </w:tcMar>
             <w:vAlign w:val="top"/>
@@ -8277,15 +10010,18 @@
           <w:p>
             <w:pPr>
               <w:spacing w:after="0" w:before="0" w:line="264"/>
-            </w:pPr>
-            <w:r>
-              <w:rPr>
-                <w:rFonts w:ascii="Arial" w:cs="Arial" w:eastAsia="Arial" w:hAnsi="Arial"/>
-                <w:color w:val="1F2937"/>
-                <w:sz w:val="17"/>
-                <w:szCs w:val="17"/>
-              </w:rPr>
-              <w:t xml:space="preserve">₹54 lakh</w:t>
+              <w:jc w:val="right"/>
+            </w:pPr>
+            <w:r>
+              <w:rPr>
+                <w:rFonts w:ascii="Arial" w:cs="Arial" w:eastAsia="Arial" w:hAnsi="Arial"/>
+                <w:b/>
+                <w:bCs/>
+                <w:color w:val="1F2937"/>
+                <w:sz w:val="16"/>
+                <w:szCs w:val="16"/>
+              </w:rPr>
+              <w:t xml:space="preserve">₹26–34 lakh</w:t>
             </w:r>
           </w:p>
         </w:tc>
@@ -8296,18 +10032,49 @@
         </w:trPr>
         <w:tc>
           <w:tcPr>
-            <w:tcW w:type="dxa" w:w="5806"/>
-            <w:tcBorders>
-              <w:top w:val="single" w:color="CBD5E1" w:sz="4"/>
-              <w:left w:val="single" w:color="CBD5E1" w:sz="4"/>
-              <w:bottom w:val="single" w:color="CBD5E1" w:sz="4"/>
-              <w:right w:val="single" w:color="CBD5E1" w:sz="4"/>
-            </w:tcBorders>
-            <w:shd w:fill="E6F4F3" w:color="auto" w:val="clear"/>
-            <w:tcMar>
-              <w:top w:type="dxa" w:w="60"/>
-              <w:left w:type="dxa" w:w="110"/>
-              <w:bottom w:type="dxa" w:w="60"/>
+            <w:tcW w:type="dxa" w:w="4906"/>
+            <w:tcBorders>
+              <w:top w:val="single" w:color="CBD5E1" w:sz="4"/>
+              <w:left w:val="single" w:color="CBD5E1" w:sz="4"/>
+              <w:bottom w:val="single" w:color="CBD5E1" w:sz="4"/>
+              <w:right w:val="single" w:color="CBD5E1" w:sz="4"/>
+            </w:tcBorders>
+            <w:tcMar>
+              <w:top w:type="dxa" w:w="45"/>
+              <w:left w:type="dxa" w:w="110"/>
+              <w:bottom w:type="dxa" w:w="45"/>
+              <w:right w:type="dxa" w:w="110"/>
+            </w:tcMar>
+            <w:vAlign w:val="top"/>
+          </w:tcPr>
+          <w:p>
+            <w:pPr>
+              <w:spacing w:after="0" w:before="0" w:line="232"/>
+            </w:pPr>
+            <w:r>
+              <w:rPr>
+                <w:rFonts w:ascii="Arial" w:cs="Arial" w:eastAsia="Arial" w:hAnsi="Arial"/>
+                <w:color w:val="1F2937"/>
+                <w:sz w:val="16"/>
+                <w:szCs w:val="16"/>
+              </w:rPr>
+              <w:t xml:space="preserve">Adaptation and deployment: Jharkhand rules and rates, entity resolution, Hindi, training, security audit</w:t>
+            </w:r>
+          </w:p>
+        </w:tc>
+        <w:tc>
+          <w:tcPr>
+            <w:tcW w:type="dxa" w:w="1750"/>
+            <w:tcBorders>
+              <w:top w:val="single" w:color="CBD5E1" w:sz="4"/>
+              <w:left w:val="single" w:color="CBD5E1" w:sz="4"/>
+              <w:bottom w:val="single" w:color="CBD5E1" w:sz="4"/>
+              <w:right w:val="single" w:color="CBD5E1" w:sz="4"/>
+            </w:tcBorders>
+            <w:tcMar>
+              <w:top w:type="dxa" w:w="45"/>
+              <w:left w:type="dxa" w:w="110"/>
+              <w:bottom w:type="dxa" w:w="45"/>
               <w:right w:type="dxa" w:w="110"/>
             </w:tcMar>
             <w:vAlign w:val="top"/>
@@ -8315,6 +10082,77 @@
           <w:p>
             <w:pPr>
               <w:spacing w:after="0" w:before="0" w:line="264"/>
+              <w:jc w:val="right"/>
+            </w:pPr>
+            <w:r>
+              <w:rPr>
+                <w:rFonts w:ascii="Arial" w:cs="Arial" w:eastAsia="Arial" w:hAnsi="Arial"/>
+                <w:b w:val="false"/>
+                <w:bCs w:val="false"/>
+                <w:color w:val="1F2937"/>
+                <w:sz w:val="16"/>
+                <w:szCs w:val="16"/>
+              </w:rPr>
+              <w:t xml:space="preserve">₹14–18 lakh</w:t>
+            </w:r>
+          </w:p>
+        </w:tc>
+        <w:tc>
+          <w:tcPr>
+            <w:tcW w:type="dxa" w:w="1750"/>
+            <w:tcBorders>
+              <w:top w:val="single" w:color="CBD5E1" w:sz="4"/>
+              <w:left w:val="single" w:color="CBD5E1" w:sz="4"/>
+              <w:bottom w:val="single" w:color="CBD5E1" w:sz="4"/>
+              <w:right w:val="single" w:color="CBD5E1" w:sz="4"/>
+            </w:tcBorders>
+            <w:tcMar>
+              <w:top w:type="dxa" w:w="45"/>
+              <w:left w:type="dxa" w:w="110"/>
+              <w:bottom w:type="dxa" w:w="45"/>
+              <w:right w:type="dxa" w:w="110"/>
+            </w:tcMar>
+            <w:vAlign w:val="top"/>
+          </w:tcPr>
+          <w:p>
+            <w:pPr>
+              <w:spacing w:after="0" w:before="0" w:line="264"/>
+              <w:jc w:val="right"/>
+            </w:pPr>
+            <w:r>
+              <w:rPr>
+                <w:rFonts w:ascii="Arial" w:cs="Arial" w:eastAsia="Arial" w:hAnsi="Arial"/>
+                <w:b w:val="false"/>
+                <w:bCs w:val="false"/>
+                <w:color w:val="1F2937"/>
+                <w:sz w:val="16"/>
+                <w:szCs w:val="16"/>
+              </w:rPr>
+              <w:t xml:space="preserve">₹20–28 lakh</w:t>
+            </w:r>
+          </w:p>
+        </w:tc>
+        <w:tc>
+          <w:tcPr>
+            <w:tcW w:type="dxa" w:w="1800"/>
+            <w:tcBorders>
+              <w:top w:val="single" w:color="CBD5E1" w:sz="4"/>
+              <w:left w:val="single" w:color="CBD5E1" w:sz="4"/>
+              <w:bottom w:val="single" w:color="CBD5E1" w:sz="4"/>
+              <w:right w:val="single" w:color="CBD5E1" w:sz="4"/>
+            </w:tcBorders>
+            <w:tcMar>
+              <w:top w:type="dxa" w:w="45"/>
+              <w:left w:type="dxa" w:w="110"/>
+              <w:bottom w:type="dxa" w:w="45"/>
+              <w:right w:type="dxa" w:w="110"/>
+            </w:tcMar>
+            <w:vAlign w:val="top"/>
+          </w:tcPr>
+          <w:p>
+            <w:pPr>
+              <w:spacing w:after="0" w:before="0" w:line="264"/>
+              <w:jc w:val="right"/>
             </w:pPr>
             <w:r>
               <w:rPr>
@@ -8322,80 +10160,10 @@
                 <w:b/>
                 <w:bCs/>
                 <w:color w:val="1F2937"/>
-                <w:sz w:val="17"/>
-                <w:szCs w:val="17"/>
-              </w:rPr>
-              <w:t xml:space="preserve">One-time total</w:t>
-            </w:r>
-          </w:p>
-        </w:tc>
-        <w:tc>
-          <w:tcPr>
-            <w:tcW w:type="dxa" w:w="2200"/>
-            <w:tcBorders>
-              <w:top w:val="single" w:color="CBD5E1" w:sz="4"/>
-              <w:left w:val="single" w:color="CBD5E1" w:sz="4"/>
-              <w:bottom w:val="single" w:color="CBD5E1" w:sz="4"/>
-              <w:right w:val="single" w:color="CBD5E1" w:sz="4"/>
-            </w:tcBorders>
-            <w:shd w:fill="E6F4F3" w:color="auto" w:val="clear"/>
-            <w:tcMar>
-              <w:top w:type="dxa" w:w="60"/>
-              <w:left w:type="dxa" w:w="110"/>
-              <w:bottom w:type="dxa" w:w="60"/>
-              <w:right w:type="dxa" w:w="110"/>
-            </w:tcMar>
-            <w:vAlign w:val="top"/>
-          </w:tcPr>
-          <w:p>
-            <w:pPr>
-              <w:spacing w:after="0" w:before="0" w:line="264"/>
-            </w:pPr>
-            <w:r>
-              <w:rPr>
-                <w:rFonts w:ascii="Arial" w:cs="Arial" w:eastAsia="Arial" w:hAnsi="Arial"/>
-                <w:b/>
-                <w:bCs/>
-                <w:color w:val="1F2937"/>
-                <w:sz w:val="17"/>
-                <w:szCs w:val="17"/>
-              </w:rPr>
-              <w:t xml:space="preserve">₹68 lakh</w:t>
-            </w:r>
-          </w:p>
-        </w:tc>
-        <w:tc>
-          <w:tcPr>
-            <w:tcW w:type="dxa" w:w="2200"/>
-            <w:tcBorders>
-              <w:top w:val="single" w:color="CBD5E1" w:sz="4"/>
-              <w:left w:val="single" w:color="CBD5E1" w:sz="4"/>
-              <w:bottom w:val="single" w:color="CBD5E1" w:sz="4"/>
-              <w:right w:val="single" w:color="CBD5E1" w:sz="4"/>
-            </w:tcBorders>
-            <w:shd w:fill="E6F4F3" w:color="auto" w:val="clear"/>
-            <w:tcMar>
-              <w:top w:type="dxa" w:w="60"/>
-              <w:left w:type="dxa" w:w="110"/>
-              <w:bottom w:type="dxa" w:w="60"/>
-              <w:right w:type="dxa" w:w="110"/>
-            </w:tcMar>
-            <w:vAlign w:val="top"/>
-          </w:tcPr>
-          <w:p>
-            <w:pPr>
-              <w:spacing w:after="0" w:before="0" w:line="264"/>
-            </w:pPr>
-            <w:r>
-              <w:rPr>
-                <w:rFonts w:ascii="Arial" w:cs="Arial" w:eastAsia="Arial" w:hAnsi="Arial"/>
-                <w:b/>
-                <w:bCs/>
-                <w:color w:val="1F2937"/>
-                <w:sz w:val="17"/>
-                <w:szCs w:val="17"/>
-              </w:rPr>
-              <w:t xml:space="preserve">₹92 lakh</w:t>
+                <w:sz w:val="16"/>
+                <w:szCs w:val="16"/>
+              </w:rPr>
+              <w:t xml:space="preserve">₹34–46 lakh</w:t>
             </w:r>
           </w:p>
         </w:tc>
@@ -8406,17 +10174,49 @@
         </w:trPr>
         <w:tc>
           <w:tcPr>
-            <w:tcW w:type="dxa" w:w="5806"/>
-            <w:tcBorders>
-              <w:top w:val="single" w:color="CBD5E1" w:sz="4"/>
-              <w:left w:val="single" w:color="CBD5E1" w:sz="4"/>
-              <w:bottom w:val="single" w:color="CBD5E1" w:sz="4"/>
-              <w:right w:val="single" w:color="CBD5E1" w:sz="4"/>
-            </w:tcBorders>
-            <w:tcMar>
-              <w:top w:type="dxa" w:w="60"/>
-              <w:left w:type="dxa" w:w="110"/>
-              <w:bottom w:type="dxa" w:w="60"/>
+            <w:tcW w:type="dxa" w:w="4906"/>
+            <w:tcBorders>
+              <w:top w:val="single" w:color="CBD5E1" w:sz="4"/>
+              <w:left w:val="single" w:color="CBD5E1" w:sz="4"/>
+              <w:bottom w:val="single" w:color="CBD5E1" w:sz="4"/>
+              <w:right w:val="single" w:color="CBD5E1" w:sz="4"/>
+            </w:tcBorders>
+            <w:tcMar>
+              <w:top w:type="dxa" w:w="45"/>
+              <w:left w:type="dxa" w:w="110"/>
+              <w:bottom w:type="dxa" w:w="45"/>
+              <w:right w:type="dxa" w:w="110"/>
+            </w:tcMar>
+            <w:vAlign w:val="top"/>
+          </w:tcPr>
+          <w:p>
+            <w:pPr>
+              <w:spacing w:after="0" w:before="0" w:line="232"/>
+            </w:pPr>
+            <w:r>
+              <w:rPr>
+                <w:rFonts w:ascii="Arial" w:cs="Arial" w:eastAsia="Arial" w:hAnsi="Arial"/>
+                <w:color w:val="1F2937"/>
+                <w:sz w:val="16"/>
+                <w:szCs w:val="16"/>
+              </w:rPr>
+              <w:t xml:space="preserve">Discovery engine: three ML layers (unsupervised, classification, rule finding) with review workflow</w:t>
+            </w:r>
+          </w:p>
+        </w:tc>
+        <w:tc>
+          <w:tcPr>
+            <w:tcW w:type="dxa" w:w="1750"/>
+            <w:tcBorders>
+              <w:top w:val="single" w:color="CBD5E1" w:sz="4"/>
+              <w:left w:val="single" w:color="CBD5E1" w:sz="4"/>
+              <w:bottom w:val="single" w:color="CBD5E1" w:sz="4"/>
+              <w:right w:val="single" w:color="CBD5E1" w:sz="4"/>
+            </w:tcBorders>
+            <w:tcMar>
+              <w:top w:type="dxa" w:w="45"/>
+              <w:left w:type="dxa" w:w="110"/>
+              <w:bottom w:type="dxa" w:w="45"/>
               <w:right w:type="dxa" w:w="110"/>
             </w:tcMar>
             <w:vAlign w:val="top"/>
@@ -8424,31 +10224,34 @@
           <w:p>
             <w:pPr>
               <w:spacing w:after="0" w:before="0" w:line="264"/>
-            </w:pPr>
-            <w:r>
-              <w:rPr>
-                <w:rFonts w:ascii="Arial" w:cs="Arial" w:eastAsia="Arial" w:hAnsi="Arial"/>
-                <w:color w:val="1F2937"/>
-                <w:sz w:val="17"/>
-                <w:szCs w:val="17"/>
-              </w:rPr>
-              <w:t xml:space="preserve">Infrastructure per year (hosting, storage, AI usage)</w:t>
-            </w:r>
-          </w:p>
-        </w:tc>
-        <w:tc>
-          <w:tcPr>
-            <w:tcW w:type="dxa" w:w="2200"/>
-            <w:tcBorders>
-              <w:top w:val="single" w:color="CBD5E1" w:sz="4"/>
-              <w:left w:val="single" w:color="CBD5E1" w:sz="4"/>
-              <w:bottom w:val="single" w:color="CBD5E1" w:sz="4"/>
-              <w:right w:val="single" w:color="CBD5E1" w:sz="4"/>
-            </w:tcBorders>
-            <w:tcMar>
-              <w:top w:type="dxa" w:w="60"/>
-              <w:left w:type="dxa" w:w="110"/>
-              <w:bottom w:type="dxa" w:w="60"/>
+              <w:jc w:val="right"/>
+            </w:pPr>
+            <w:r>
+              <w:rPr>
+                <w:rFonts w:ascii="Arial" w:cs="Arial" w:eastAsia="Arial" w:hAnsi="Arial"/>
+                <w:b w:val="false"/>
+                <w:bCs w:val="false"/>
+                <w:color w:val="1F2937"/>
+                <w:sz w:val="16"/>
+                <w:szCs w:val="16"/>
+              </w:rPr>
+              <w:t xml:space="preserve">–</w:t>
+            </w:r>
+          </w:p>
+        </w:tc>
+        <w:tc>
+          <w:tcPr>
+            <w:tcW w:type="dxa" w:w="1750"/>
+            <w:tcBorders>
+              <w:top w:val="single" w:color="CBD5E1" w:sz="4"/>
+              <w:left w:val="single" w:color="CBD5E1" w:sz="4"/>
+              <w:bottom w:val="single" w:color="CBD5E1" w:sz="4"/>
+              <w:right w:val="single" w:color="CBD5E1" w:sz="4"/>
+            </w:tcBorders>
+            <w:tcMar>
+              <w:top w:type="dxa" w:w="45"/>
+              <w:left w:type="dxa" w:w="110"/>
+              <w:bottom w:type="dxa" w:w="45"/>
               <w:right w:type="dxa" w:w="110"/>
             </w:tcMar>
             <w:vAlign w:val="top"/>
@@ -8456,31 +10259,34 @@
           <w:p>
             <w:pPr>
               <w:spacing w:after="0" w:before="0" w:line="264"/>
-            </w:pPr>
-            <w:r>
-              <w:rPr>
-                <w:rFonts w:ascii="Arial" w:cs="Arial" w:eastAsia="Arial" w:hAnsi="Arial"/>
-                <w:color w:val="1F2937"/>
-                <w:sz w:val="17"/>
-                <w:szCs w:val="17"/>
-              </w:rPr>
-              <w:t xml:space="preserve">₹4 lakh</w:t>
-            </w:r>
-          </w:p>
-        </w:tc>
-        <w:tc>
-          <w:tcPr>
-            <w:tcW w:type="dxa" w:w="2200"/>
-            <w:tcBorders>
-              <w:top w:val="single" w:color="CBD5E1" w:sz="4"/>
-              <w:left w:val="single" w:color="CBD5E1" w:sz="4"/>
-              <w:bottom w:val="single" w:color="CBD5E1" w:sz="4"/>
-              <w:right w:val="single" w:color="CBD5E1" w:sz="4"/>
-            </w:tcBorders>
-            <w:tcMar>
-              <w:top w:type="dxa" w:w="60"/>
-              <w:left w:type="dxa" w:w="110"/>
-              <w:bottom w:type="dxa" w:w="60"/>
+              <w:jc w:val="right"/>
+            </w:pPr>
+            <w:r>
+              <w:rPr>
+                <w:rFonts w:ascii="Arial" w:cs="Arial" w:eastAsia="Arial" w:hAnsi="Arial"/>
+                <w:b w:val="false"/>
+                <w:bCs w:val="false"/>
+                <w:color w:val="1F2937"/>
+                <w:sz w:val="16"/>
+                <w:szCs w:val="16"/>
+              </w:rPr>
+              <w:t xml:space="preserve">₹24–32 lakh</w:t>
+            </w:r>
+          </w:p>
+        </w:tc>
+        <w:tc>
+          <w:tcPr>
+            <w:tcW w:type="dxa" w:w="1800"/>
+            <w:tcBorders>
+              <w:top w:val="single" w:color="CBD5E1" w:sz="4"/>
+              <w:left w:val="single" w:color="CBD5E1" w:sz="4"/>
+              <w:bottom w:val="single" w:color="CBD5E1" w:sz="4"/>
+              <w:right w:val="single" w:color="CBD5E1" w:sz="4"/>
+            </w:tcBorders>
+            <w:tcMar>
+              <w:top w:type="dxa" w:w="45"/>
+              <w:left w:type="dxa" w:w="110"/>
+              <w:bottom w:type="dxa" w:w="45"/>
               <w:right w:type="dxa" w:w="110"/>
             </w:tcMar>
             <w:vAlign w:val="top"/>
@@ -8488,15 +10294,18 @@
           <w:p>
             <w:pPr>
               <w:spacing w:after="0" w:before="0" w:line="264"/>
-            </w:pPr>
-            <w:r>
-              <w:rPr>
-                <w:rFonts w:ascii="Arial" w:cs="Arial" w:eastAsia="Arial" w:hAnsi="Arial"/>
-                <w:color w:val="1F2937"/>
-                <w:sz w:val="17"/>
-                <w:szCs w:val="17"/>
-              </w:rPr>
-              <w:t xml:space="preserve">₹8 lakh</w:t>
+              <w:jc w:val="right"/>
+            </w:pPr>
+            <w:r>
+              <w:rPr>
+                <w:rFonts w:ascii="Arial" w:cs="Arial" w:eastAsia="Arial" w:hAnsi="Arial"/>
+                <w:b/>
+                <w:bCs/>
+                <w:color w:val="1F2937"/>
+                <w:sz w:val="16"/>
+                <w:szCs w:val="16"/>
+              </w:rPr>
+              <w:t xml:space="preserve">₹24–32 lakh</w:t>
             </w:r>
           </w:p>
         </w:tc>
@@ -8507,17 +10316,53 @@
         </w:trPr>
         <w:tc>
           <w:tcPr>
-            <w:tcW w:type="dxa" w:w="5806"/>
-            <w:tcBorders>
-              <w:top w:val="single" w:color="CBD5E1" w:sz="4"/>
-              <w:left w:val="single" w:color="CBD5E1" w:sz="4"/>
-              <w:bottom w:val="single" w:color="CBD5E1" w:sz="4"/>
-              <w:right w:val="single" w:color="CBD5E1" w:sz="4"/>
-            </w:tcBorders>
-            <w:tcMar>
-              <w:top w:type="dxa" w:w="60"/>
-              <w:left w:type="dxa" w:w="110"/>
-              <w:bottom w:type="dxa" w:w="60"/>
+            <w:tcW w:type="dxa" w:w="4906"/>
+            <w:tcBorders>
+              <w:top w:val="single" w:color="CBD5E1" w:sz="4"/>
+              <w:left w:val="single" w:color="CBD5E1" w:sz="4"/>
+              <w:bottom w:val="single" w:color="CBD5E1" w:sz="4"/>
+              <w:right w:val="single" w:color="CBD5E1" w:sz="4"/>
+            </w:tcBorders>
+            <w:shd w:fill="E6F4F3" w:color="auto" w:val="clear"/>
+            <w:tcMar>
+              <w:top w:type="dxa" w:w="45"/>
+              <w:left w:type="dxa" w:w="110"/>
+              <w:bottom w:type="dxa" w:w="45"/>
+              <w:right w:type="dxa" w:w="110"/>
+            </w:tcMar>
+            <w:vAlign w:val="top"/>
+          </w:tcPr>
+          <w:p>
+            <w:pPr>
+              <w:spacing w:after="0" w:before="0" w:line="232"/>
+            </w:pPr>
+            <w:r>
+              <w:rPr>
+                <w:rFonts w:ascii="Arial" w:cs="Arial" w:eastAsia="Arial" w:hAnsi="Arial"/>
+                <w:b/>
+                <w:bCs/>
+                <w:color w:val="1F2937"/>
+                <w:sz w:val="16"/>
+                <w:szCs w:val="16"/>
+              </w:rPr>
+              <w:t xml:space="preserve">One-time total</w:t>
+            </w:r>
+          </w:p>
+        </w:tc>
+        <w:tc>
+          <w:tcPr>
+            <w:tcW w:type="dxa" w:w="1750"/>
+            <w:tcBorders>
+              <w:top w:val="single" w:color="CBD5E1" w:sz="4"/>
+              <w:left w:val="single" w:color="CBD5E1" w:sz="4"/>
+              <w:bottom w:val="single" w:color="CBD5E1" w:sz="4"/>
+              <w:right w:val="single" w:color="CBD5E1" w:sz="4"/>
+            </w:tcBorders>
+            <w:shd w:fill="E6F4F3" w:color="auto" w:val="clear"/>
+            <w:tcMar>
+              <w:top w:type="dxa" w:w="45"/>
+              <w:left w:type="dxa" w:w="110"/>
+              <w:bottom w:type="dxa" w:w="45"/>
               <w:right w:type="dxa" w:w="110"/>
             </w:tcMar>
             <w:vAlign w:val="top"/>
@@ -8525,31 +10370,35 @@
           <w:p>
             <w:pPr>
               <w:spacing w:after="0" w:before="0" w:line="264"/>
-            </w:pPr>
-            <w:r>
-              <w:rPr>
-                <w:rFonts w:ascii="Arial" w:cs="Arial" w:eastAsia="Arial" w:hAnsi="Arial"/>
-                <w:color w:val="1F2937"/>
-                <w:sz w:val="17"/>
-                <w:szCs w:val="17"/>
-              </w:rPr>
-              <w:t xml:space="preserve">Operations &amp; maintenance per year (support, rule and rate updates, helpdesk)</w:t>
-            </w:r>
-          </w:p>
-        </w:tc>
-        <w:tc>
-          <w:tcPr>
-            <w:tcW w:type="dxa" w:w="2200"/>
-            <w:tcBorders>
-              <w:top w:val="single" w:color="CBD5E1" w:sz="4"/>
-              <w:left w:val="single" w:color="CBD5E1" w:sz="4"/>
-              <w:bottom w:val="single" w:color="CBD5E1" w:sz="4"/>
-              <w:right w:val="single" w:color="CBD5E1" w:sz="4"/>
-            </w:tcBorders>
-            <w:tcMar>
-              <w:top w:type="dxa" w:w="60"/>
-              <w:left w:type="dxa" w:w="110"/>
-              <w:bottom w:type="dxa" w:w="60"/>
+              <w:jc w:val="right"/>
+            </w:pPr>
+            <w:r>
+              <w:rPr>
+                <w:rFonts w:ascii="Arial" w:cs="Arial" w:eastAsia="Arial" w:hAnsi="Arial"/>
+                <w:b/>
+                <w:bCs/>
+                <w:color w:val="1F2937"/>
+                <w:sz w:val="16"/>
+                <w:szCs w:val="16"/>
+              </w:rPr>
+              <w:t xml:space="preserve">₹34–44 lakh</w:t>
+            </w:r>
+          </w:p>
+        </w:tc>
+        <w:tc>
+          <w:tcPr>
+            <w:tcW w:type="dxa" w:w="1750"/>
+            <w:tcBorders>
+              <w:top w:val="single" w:color="CBD5E1" w:sz="4"/>
+              <w:left w:val="single" w:color="CBD5E1" w:sz="4"/>
+              <w:bottom w:val="single" w:color="CBD5E1" w:sz="4"/>
+              <w:right w:val="single" w:color="CBD5E1" w:sz="4"/>
+            </w:tcBorders>
+            <w:shd w:fill="E6F4F3" w:color="auto" w:val="clear"/>
+            <w:tcMar>
+              <w:top w:type="dxa" w:w="45"/>
+              <w:left w:type="dxa" w:w="110"/>
+              <w:bottom w:type="dxa" w:w="45"/>
               <w:right w:type="dxa" w:w="110"/>
             </w:tcMar>
             <w:vAlign w:val="top"/>
@@ -8557,31 +10406,35 @@
           <w:p>
             <w:pPr>
               <w:spacing w:after="0" w:before="0" w:line="264"/>
-            </w:pPr>
-            <w:r>
-              <w:rPr>
-                <w:rFonts w:ascii="Arial" w:cs="Arial" w:eastAsia="Arial" w:hAnsi="Arial"/>
-                <w:color w:val="1F2937"/>
-                <w:sz w:val="17"/>
-                <w:szCs w:val="17"/>
-              </w:rPr>
-              <w:t xml:space="preserve">₹12 lakh</w:t>
-            </w:r>
-          </w:p>
-        </w:tc>
-        <w:tc>
-          <w:tcPr>
-            <w:tcW w:type="dxa" w:w="2200"/>
-            <w:tcBorders>
-              <w:top w:val="single" w:color="CBD5E1" w:sz="4"/>
-              <w:left w:val="single" w:color="CBD5E1" w:sz="4"/>
-              <w:bottom w:val="single" w:color="CBD5E1" w:sz="4"/>
-              <w:right w:val="single" w:color="CBD5E1" w:sz="4"/>
-            </w:tcBorders>
-            <w:tcMar>
-              <w:top w:type="dxa" w:w="60"/>
-              <w:left w:type="dxa" w:w="110"/>
-              <w:bottom w:type="dxa" w:w="60"/>
+              <w:jc w:val="right"/>
+            </w:pPr>
+            <w:r>
+              <w:rPr>
+                <w:rFonts w:ascii="Arial" w:cs="Arial" w:eastAsia="Arial" w:hAnsi="Arial"/>
+                <w:b/>
+                <w:bCs/>
+                <w:color w:val="1F2937"/>
+                <w:sz w:val="16"/>
+                <w:szCs w:val="16"/>
+              </w:rPr>
+              <w:t xml:space="preserve">₹80 lakh–1.08 cr</w:t>
+            </w:r>
+          </w:p>
+        </w:tc>
+        <w:tc>
+          <w:tcPr>
+            <w:tcW w:type="dxa" w:w="1800"/>
+            <w:tcBorders>
+              <w:top w:val="single" w:color="CBD5E1" w:sz="4"/>
+              <w:left w:val="single" w:color="CBD5E1" w:sz="4"/>
+              <w:bottom w:val="single" w:color="CBD5E1" w:sz="4"/>
+              <w:right w:val="single" w:color="CBD5E1" w:sz="4"/>
+            </w:tcBorders>
+            <w:shd w:fill="E6F4F3" w:color="auto" w:val="clear"/>
+            <w:tcMar>
+              <w:top w:type="dxa" w:w="45"/>
+              <w:left w:type="dxa" w:w="110"/>
+              <w:bottom w:type="dxa" w:w="45"/>
               <w:right w:type="dxa" w:w="110"/>
             </w:tcMar>
             <w:vAlign w:val="top"/>
@@ -8589,15 +10442,127 @@
           <w:p>
             <w:pPr>
               <w:spacing w:after="0" w:before="0" w:line="264"/>
-            </w:pPr>
-            <w:r>
-              <w:rPr>
-                <w:rFonts w:ascii="Arial" w:cs="Arial" w:eastAsia="Arial" w:hAnsi="Arial"/>
-                <w:color w:val="1F2937"/>
-                <w:sz w:val="17"/>
-                <w:szCs w:val="17"/>
-              </w:rPr>
-              <w:t xml:space="preserve">₹18 lakh</w:t>
+              <w:jc w:val="right"/>
+            </w:pPr>
+            <w:r>
+              <w:rPr>
+                <w:rFonts w:ascii="Arial" w:cs="Arial" w:eastAsia="Arial" w:hAnsi="Arial"/>
+                <w:b/>
+                <w:bCs/>
+                <w:color w:val="1F2937"/>
+                <w:sz w:val="16"/>
+                <w:szCs w:val="16"/>
+              </w:rPr>
+              <w:t xml:space="preserve">₹1.14–1.52 cr</w:t>
+            </w:r>
+          </w:p>
+        </w:tc>
+      </w:tr>
+    </w:tbl>
+    <w:p>
+      <w:pPr>
+        <w:spacing w:after="30" w:before="0" w:line="264"/>
+      </w:pPr>
+      <w:r>
+        <w:rPr>
+          <w:rFonts w:ascii="Arial" w:cs="Arial" w:eastAsia="Arial" w:hAnsi="Arial"/>
+          <w:color w:val="1F2937"/>
+          <w:sz w:val="19"/>
+          <w:szCs w:val="19"/>
+        </w:rPr>
+        <w:t xml:space="preserve"/>
+      </w:r>
+    </w:p>
+    <w:tbl>
+      <w:tblPr>
+        <w:tblW w:type="dxa" w:w="10206"/>
+        <w:tblBorders>
+          <w:top w:val="single" w:color="auto" w:sz="4"/>
+          <w:left w:val="single" w:color="auto" w:sz="4"/>
+          <w:bottom w:val="single" w:color="auto" w:sz="4"/>
+          <w:right w:val="single" w:color="auto" w:sz="4"/>
+          <w:insideH w:val="single" w:color="auto" w:sz="4"/>
+          <w:insideV w:val="single" w:color="auto" w:sz="4"/>
+        </w:tblBorders>
+        <w:tblLayout w:type="fixed"/>
+      </w:tblPr>
+      <w:tblGrid>
+        <w:gridCol w:w="6606"/>
+        <w:gridCol w:w="3600"/>
+      </w:tblGrid>
+      <w:tr>
+        <w:trPr>
+          <w:cantSplit/>
+          <w:tblHeader/>
+        </w:trPr>
+        <w:tc>
+          <w:tcPr>
+            <w:tcW w:type="dxa" w:w="6606"/>
+            <w:tcBorders>
+              <w:top w:val="single" w:color="CBD5E1" w:sz="4"/>
+              <w:left w:val="single" w:color="CBD5E1" w:sz="4"/>
+              <w:bottom w:val="single" w:color="CBD5E1" w:sz="4"/>
+              <w:right w:val="single" w:color="CBD5E1" w:sz="4"/>
+            </w:tcBorders>
+            <w:shd w:fill="1B2A44" w:color="auto" w:val="clear"/>
+            <w:tcMar>
+              <w:top w:type="dxa" w:w="50"/>
+              <w:left w:type="dxa" w:w="110"/>
+              <w:bottom w:type="dxa" w:w="50"/>
+              <w:right w:type="dxa" w:w="110"/>
+            </w:tcMar>
+            <w:vAlign w:val="top"/>
+          </w:tcPr>
+          <w:p>
+            <w:pPr>
+              <w:spacing w:after="0" w:before="0" w:line="264"/>
+            </w:pPr>
+            <w:r>
+              <w:rPr>
+                <w:rFonts w:ascii="Arial" w:cs="Arial" w:eastAsia="Arial" w:hAnsi="Arial"/>
+                <w:b/>
+                <w:bCs/>
+                <w:color w:val="FFFFFF"/>
+                <w:sz w:val="16"/>
+                <w:szCs w:val="16"/>
+              </w:rPr>
+              <w:t xml:space="preserve">Recurring and optional</w:t>
+            </w:r>
+          </w:p>
+        </w:tc>
+        <w:tc>
+          <w:tcPr>
+            <w:tcW w:type="dxa" w:w="3600"/>
+            <w:tcBorders>
+              <w:top w:val="single" w:color="CBD5E1" w:sz="4"/>
+              <w:left w:val="single" w:color="CBD5E1" w:sz="4"/>
+              <w:bottom w:val="single" w:color="CBD5E1" w:sz="4"/>
+              <w:right w:val="single" w:color="CBD5E1" w:sz="4"/>
+            </w:tcBorders>
+            <w:shd w:fill="1B2A44" w:color="auto" w:val="clear"/>
+            <w:tcMar>
+              <w:top w:type="dxa" w:w="50"/>
+              <w:left w:type="dxa" w:w="110"/>
+              <w:bottom w:type="dxa" w:w="50"/>
+              <w:right w:type="dxa" w:w="110"/>
+            </w:tcMar>
+            <w:vAlign w:val="top"/>
+          </w:tcPr>
+          <w:p>
+            <w:pPr>
+              <w:spacing w:after="0" w:before="0" w:line="264"/>
+              <w:jc w:val="right"/>
+            </w:pPr>
+            <w:r>
+              <w:rPr>
+                <w:rFonts w:ascii="Arial" w:cs="Arial" w:eastAsia="Arial" w:hAnsi="Arial"/>
+                <w:b/>
+                <w:bCs/>
+                <w:color w:val="FFFFFF"/>
+                <w:sz w:val="16"/>
+                <w:szCs w:val="16"/>
+              </w:rPr>
+              <w:t xml:space="preserve">Amount</w:t>
             </w:r>
           </w:p>
         </w:tc>
@@ -8608,18 +10573,49 @@
         </w:trPr>
         <w:tc>
           <w:tcPr>
-            <w:tcW w:type="dxa" w:w="5806"/>
-            <w:tcBorders>
-              <w:top w:val="single" w:color="CBD5E1" w:sz="4"/>
-              <w:left w:val="single" w:color="CBD5E1" w:sz="4"/>
-              <w:bottom w:val="single" w:color="CBD5E1" w:sz="4"/>
-              <w:right w:val="single" w:color="CBD5E1" w:sz="4"/>
-            </w:tcBorders>
-            <w:shd w:fill="E6F4F3" w:color="auto" w:val="clear"/>
-            <w:tcMar>
-              <w:top w:type="dxa" w:w="60"/>
-              <w:left w:type="dxa" w:w="110"/>
-              <w:bottom w:type="dxa" w:w="60"/>
+            <w:tcW w:type="dxa" w:w="6606"/>
+            <w:tcBorders>
+              <w:top w:val="single" w:color="CBD5E1" w:sz="4"/>
+              <w:left w:val="single" w:color="CBD5E1" w:sz="4"/>
+              <w:bottom w:val="single" w:color="CBD5E1" w:sz="4"/>
+              <w:right w:val="single" w:color="CBD5E1" w:sz="4"/>
+            </w:tcBorders>
+            <w:tcMar>
+              <w:top w:type="dxa" w:w="45"/>
+              <w:left w:type="dxa" w:w="110"/>
+              <w:bottom w:type="dxa" w:w="45"/>
+              <w:right w:type="dxa" w:w="110"/>
+            </w:tcMar>
+            <w:vAlign w:val="top"/>
+          </w:tcPr>
+          <w:p>
+            <w:pPr>
+              <w:spacing w:after="0" w:before="0" w:line="232"/>
+            </w:pPr>
+            <w:r>
+              <w:rPr>
+                <w:rFonts w:ascii="Arial" w:cs="Arial" w:eastAsia="Arial" w:hAnsi="Arial"/>
+                <w:color w:val="1F2937"/>
+                <w:sz w:val="16"/>
+                <w:szCs w:val="16"/>
+              </w:rPr>
+              <w:t xml:space="preserve">Infrastructure per year: data lake storage, Trino cluster, application and ML compute (government-approved cloud)</w:t>
+            </w:r>
+          </w:p>
+        </w:tc>
+        <w:tc>
+          <w:tcPr>
+            <w:tcW w:type="dxa" w:w="3600"/>
+            <w:tcBorders>
+              <w:top w:val="single" w:color="CBD5E1" w:sz="4"/>
+              <w:left w:val="single" w:color="CBD5E1" w:sz="4"/>
+              <w:bottom w:val="single" w:color="CBD5E1" w:sz="4"/>
+              <w:right w:val="single" w:color="CBD5E1" w:sz="4"/>
+            </w:tcBorders>
+            <w:tcMar>
+              <w:top w:type="dxa" w:w="45"/>
+              <w:left w:type="dxa" w:w="110"/>
+              <w:bottom w:type="dxa" w:w="45"/>
               <w:right w:type="dxa" w:w="110"/>
             </w:tcMar>
             <w:vAlign w:val="top"/>
@@ -8627,6 +10623,7 @@
           <w:p>
             <w:pPr>
               <w:spacing w:after="0" w:before="0" w:line="264"/>
+              <w:jc w:val="right"/>
             </w:pPr>
             <w:r>
               <w:rPr>
@@ -8634,80 +10631,10 @@
                 <w:b/>
                 <w:bCs/>
                 <w:color w:val="1F2937"/>
-                <w:sz w:val="17"/>
-                <w:szCs w:val="17"/>
-              </w:rPr>
-              <w:t xml:space="preserve">Recurring total per year</w:t>
-            </w:r>
-          </w:p>
-        </w:tc>
-        <w:tc>
-          <w:tcPr>
-            <w:tcW w:type="dxa" w:w="2200"/>
-            <w:tcBorders>
-              <w:top w:val="single" w:color="CBD5E1" w:sz="4"/>
-              <w:left w:val="single" w:color="CBD5E1" w:sz="4"/>
-              <w:bottom w:val="single" w:color="CBD5E1" w:sz="4"/>
-              <w:right w:val="single" w:color="CBD5E1" w:sz="4"/>
-            </w:tcBorders>
-            <w:shd w:fill="E6F4F3" w:color="auto" w:val="clear"/>
-            <w:tcMar>
-              <w:top w:type="dxa" w:w="60"/>
-              <w:left w:type="dxa" w:w="110"/>
-              <w:bottom w:type="dxa" w:w="60"/>
-              <w:right w:type="dxa" w:w="110"/>
-            </w:tcMar>
-            <w:vAlign w:val="top"/>
-          </w:tcPr>
-          <w:p>
-            <w:pPr>
-              <w:spacing w:after="0" w:before="0" w:line="264"/>
-            </w:pPr>
-            <w:r>
-              <w:rPr>
-                <w:rFonts w:ascii="Arial" w:cs="Arial" w:eastAsia="Arial" w:hAnsi="Arial"/>
-                <w:b/>
-                <w:bCs/>
-                <w:color w:val="1F2937"/>
-                <w:sz w:val="17"/>
-                <w:szCs w:val="17"/>
-              </w:rPr>
-              <w:t xml:space="preserve">₹16 lakh</w:t>
-            </w:r>
-          </w:p>
-        </w:tc>
-        <w:tc>
-          <w:tcPr>
-            <w:tcW w:type="dxa" w:w="2200"/>
-            <w:tcBorders>
-              <w:top w:val="single" w:color="CBD5E1" w:sz="4"/>
-              <w:left w:val="single" w:color="CBD5E1" w:sz="4"/>
-              <w:bottom w:val="single" w:color="CBD5E1" w:sz="4"/>
-              <w:right w:val="single" w:color="CBD5E1" w:sz="4"/>
-            </w:tcBorders>
-            <w:shd w:fill="E6F4F3" w:color="auto" w:val="clear"/>
-            <w:tcMar>
-              <w:top w:type="dxa" w:w="60"/>
-              <w:left w:type="dxa" w:w="110"/>
-              <w:bottom w:type="dxa" w:w="60"/>
-              <w:right w:type="dxa" w:w="110"/>
-            </w:tcMar>
-            <w:vAlign w:val="top"/>
-          </w:tcPr>
-          <w:p>
-            <w:pPr>
-              <w:spacing w:after="0" w:before="0" w:line="264"/>
-            </w:pPr>
-            <w:r>
-              <w:rPr>
-                <w:rFonts w:ascii="Arial" w:cs="Arial" w:eastAsia="Arial" w:hAnsi="Arial"/>
-                <w:b/>
-                <w:bCs/>
-                <w:color w:val="1F2937"/>
-                <w:sz w:val="17"/>
-                <w:szCs w:val="17"/>
-              </w:rPr>
-              <w:t xml:space="preserve">₹26 lakh</w:t>
+                <w:sz w:val="16"/>
+                <w:szCs w:val="16"/>
+              </w:rPr>
+              <w:t xml:space="preserve">₹15–25 lakh / yr</w:t>
             </w:r>
           </w:p>
         </w:tc>
@@ -8718,17 +10645,49 @@
         </w:trPr>
         <w:tc>
           <w:tcPr>
-            <w:tcW w:type="dxa" w:w="5806"/>
-            <w:tcBorders>
-              <w:top w:val="single" w:color="CBD5E1" w:sz="4"/>
-              <w:left w:val="single" w:color="CBD5E1" w:sz="4"/>
-              <w:bottom w:val="single" w:color="CBD5E1" w:sz="4"/>
-              <w:right w:val="single" w:color="CBD5E1" w:sz="4"/>
-            </w:tcBorders>
-            <w:tcMar>
-              <w:top w:type="dxa" w:w="60"/>
-              <w:left w:type="dxa" w:w="110"/>
-              <w:bottom w:type="dxa" w:w="60"/>
+            <w:tcW w:type="dxa" w:w="6606"/>
+            <w:tcBorders>
+              <w:top w:val="single" w:color="CBD5E1" w:sz="4"/>
+              <w:left w:val="single" w:color="CBD5E1" w:sz="4"/>
+              <w:bottom w:val="single" w:color="CBD5E1" w:sz="4"/>
+              <w:right w:val="single" w:color="CBD5E1" w:sz="4"/>
+            </w:tcBorders>
+            <w:tcMar>
+              <w:top w:type="dxa" w:w="45"/>
+              <w:left w:type="dxa" w:w="110"/>
+              <w:bottom w:type="dxa" w:w="45"/>
+              <w:right w:type="dxa" w:w="110"/>
+            </w:tcMar>
+            <w:vAlign w:val="top"/>
+          </w:tcPr>
+          <w:p>
+            <w:pPr>
+              <w:spacing w:after="0" w:before="0" w:line="232"/>
+            </w:pPr>
+            <w:r>
+              <w:rPr>
+                <w:rFonts w:ascii="Arial" w:cs="Arial" w:eastAsia="Arial" w:hAnsi="Arial"/>
+                <w:color w:val="1F2937"/>
+                <w:sz w:val="16"/>
+                <w:szCs w:val="16"/>
+              </w:rPr>
+              <w:t xml:space="preserve">Annual maintenance: platform support and upgrades, rule and rate updates, model retraining, helpdesk</w:t>
+            </w:r>
+          </w:p>
+        </w:tc>
+        <w:tc>
+          <w:tcPr>
+            <w:tcW w:type="dxa" w:w="3600"/>
+            <w:tcBorders>
+              <w:top w:val="single" w:color="CBD5E1" w:sz="4"/>
+              <w:left w:val="single" w:color="CBD5E1" w:sz="4"/>
+              <w:bottom w:val="single" w:color="CBD5E1" w:sz="4"/>
+              <w:right w:val="single" w:color="CBD5E1" w:sz="4"/>
+            </w:tcBorders>
+            <w:tcMar>
+              <w:top w:type="dxa" w:w="45"/>
+              <w:left w:type="dxa" w:w="110"/>
+              <w:bottom w:type="dxa" w:w="45"/>
               <w:right w:type="dxa" w:w="110"/>
             </w:tcMar>
             <w:vAlign w:val="top"/>
@@ -8736,31 +10695,75 @@
           <w:p>
             <w:pPr>
               <w:spacing w:after="0" w:before="0" w:line="264"/>
-            </w:pPr>
-            <w:r>
-              <w:rPr>
-                <w:rFonts w:ascii="Arial" w:cs="Arial" w:eastAsia="Arial" w:hAnsi="Arial"/>
-                <w:color w:val="1F2937"/>
-                <w:sz w:val="17"/>
-                <w:szCs w:val="17"/>
-              </w:rPr>
-              <w:t xml:space="preserve">Optional: municipal edition for 3 urban local bodies</w:t>
-            </w:r>
-          </w:p>
-        </w:tc>
-        <w:tc>
-          <w:tcPr>
-            <w:tcW w:type="dxa" w:w="2200"/>
-            <w:tcBorders>
-              <w:top w:val="single" w:color="CBD5E1" w:sz="4"/>
-              <w:left w:val="single" w:color="CBD5E1" w:sz="4"/>
-              <w:bottom w:val="single" w:color="CBD5E1" w:sz="4"/>
-              <w:right w:val="single" w:color="CBD5E1" w:sz="4"/>
-            </w:tcBorders>
-            <w:tcMar>
-              <w:top w:type="dxa" w:w="60"/>
-              <w:left w:type="dxa" w:w="110"/>
-              <w:bottom w:type="dxa" w:w="60"/>
+              <w:jc w:val="right"/>
+            </w:pPr>
+            <w:r>
+              <w:rPr>
+                <w:rFonts w:ascii="Arial" w:cs="Arial" w:eastAsia="Arial" w:hAnsi="Arial"/>
+                <w:b/>
+                <w:bCs/>
+                <w:color w:val="1F2937"/>
+                <w:sz w:val="16"/>
+                <w:szCs w:val="16"/>
+              </w:rPr>
+              <w:t xml:space="preserve">₹18–26 lakh / yr</w:t>
+            </w:r>
+          </w:p>
+        </w:tc>
+      </w:tr>
+      <w:tr>
+        <w:trPr>
+          <w:cantSplit/>
+        </w:trPr>
+        <w:tc>
+          <w:tcPr>
+            <w:tcW w:type="dxa" w:w="6606"/>
+            <w:tcBorders>
+              <w:top w:val="single" w:color="CBD5E1" w:sz="4"/>
+              <w:left w:val="single" w:color="CBD5E1" w:sz="4"/>
+              <w:bottom w:val="single" w:color="CBD5E1" w:sz="4"/>
+              <w:right w:val="single" w:color="CBD5E1" w:sz="4"/>
+            </w:tcBorders>
+            <w:shd w:fill="E6F4F3" w:color="auto" w:val="clear"/>
+            <w:tcMar>
+              <w:top w:type="dxa" w:w="45"/>
+              <w:left w:type="dxa" w:w="110"/>
+              <w:bottom w:type="dxa" w:w="45"/>
+              <w:right w:type="dxa" w:w="110"/>
+            </w:tcMar>
+            <w:vAlign w:val="top"/>
+          </w:tcPr>
+          <w:p>
+            <w:pPr>
+              <w:spacing w:after="0" w:before="0" w:line="232"/>
+            </w:pPr>
+            <w:r>
+              <w:rPr>
+                <w:rFonts w:ascii="Arial" w:cs="Arial" w:eastAsia="Arial" w:hAnsi="Arial"/>
+                <w:b/>
+                <w:bCs/>
+                <w:color w:val="1F2937"/>
+                <w:sz w:val="16"/>
+                <w:szCs w:val="16"/>
+              </w:rPr>
+              <w:t xml:space="preserve">Recurring total per year</w:t>
+            </w:r>
+          </w:p>
+        </w:tc>
+        <w:tc>
+          <w:tcPr>
+            <w:tcW w:type="dxa" w:w="3600"/>
+            <w:tcBorders>
+              <w:top w:val="single" w:color="CBD5E1" w:sz="4"/>
+              <w:left w:val="single" w:color="CBD5E1" w:sz="4"/>
+              <w:bottom w:val="single" w:color="CBD5E1" w:sz="4"/>
+              <w:right w:val="single" w:color="CBD5E1" w:sz="4"/>
+            </w:tcBorders>
+            <w:shd w:fill="E6F4F3" w:color="auto" w:val="clear"/>
+            <w:tcMar>
+              <w:top w:type="dxa" w:w="45"/>
+              <w:left w:type="dxa" w:w="110"/>
+              <w:bottom w:type="dxa" w:w="45"/>
               <w:right w:type="dxa" w:w="110"/>
             </w:tcMar>
             <w:vAlign w:val="top"/>
@@ -8768,31 +10771,71 @@
           <w:p>
             <w:pPr>
               <w:spacing w:after="0" w:before="0" w:line="264"/>
-            </w:pPr>
-            <w:r>
-              <w:rPr>
-                <w:rFonts w:ascii="Arial" w:cs="Arial" w:eastAsia="Arial" w:hAnsi="Arial"/>
-                <w:color w:val="1F2937"/>
-                <w:sz w:val="17"/>
-                <w:szCs w:val="17"/>
-              </w:rPr>
-              <w:t xml:space="preserve">₹15 lakh</w:t>
-            </w:r>
-          </w:p>
-        </w:tc>
-        <w:tc>
-          <w:tcPr>
-            <w:tcW w:type="dxa" w:w="2200"/>
-            <w:tcBorders>
-              <w:top w:val="single" w:color="CBD5E1" w:sz="4"/>
-              <w:left w:val="single" w:color="CBD5E1" w:sz="4"/>
-              <w:bottom w:val="single" w:color="CBD5E1" w:sz="4"/>
-              <w:right w:val="single" w:color="CBD5E1" w:sz="4"/>
-            </w:tcBorders>
-            <w:tcMar>
-              <w:top w:type="dxa" w:w="60"/>
-              <w:left w:type="dxa" w:w="110"/>
-              <w:bottom w:type="dxa" w:w="60"/>
+              <w:jc w:val="right"/>
+            </w:pPr>
+            <w:r>
+              <w:rPr>
+                <w:rFonts w:ascii="Arial" w:cs="Arial" w:eastAsia="Arial" w:hAnsi="Arial"/>
+                <w:b/>
+                <w:bCs/>
+                <w:color w:val="1F2937"/>
+                <w:sz w:val="16"/>
+                <w:szCs w:val="16"/>
+              </w:rPr>
+              <w:t xml:space="preserve">₹33–51 lakh / yr</w:t>
+            </w:r>
+          </w:p>
+        </w:tc>
+      </w:tr>
+      <w:tr>
+        <w:trPr>
+          <w:cantSplit/>
+        </w:trPr>
+        <w:tc>
+          <w:tcPr>
+            <w:tcW w:type="dxa" w:w="6606"/>
+            <w:tcBorders>
+              <w:top w:val="single" w:color="CBD5E1" w:sz="4"/>
+              <w:left w:val="single" w:color="CBD5E1" w:sz="4"/>
+              <w:bottom w:val="single" w:color="CBD5E1" w:sz="4"/>
+              <w:right w:val="single" w:color="CBD5E1" w:sz="4"/>
+            </w:tcBorders>
+            <w:tcMar>
+              <w:top w:type="dxa" w:w="45"/>
+              <w:left w:type="dxa" w:w="110"/>
+              <w:bottom w:type="dxa" w:w="45"/>
+              <w:right w:type="dxa" w:w="110"/>
+            </w:tcMar>
+            <w:vAlign w:val="top"/>
+          </w:tcPr>
+          <w:p>
+            <w:pPr>
+              <w:spacing w:after="0" w:before="0" w:line="232"/>
+            </w:pPr>
+            <w:r>
+              <w:rPr>
+                <w:rFonts w:ascii="Arial" w:cs="Arial" w:eastAsia="Arial" w:hAnsi="Arial"/>
+                <w:color w:val="1F2937"/>
+                <w:sz w:val="16"/>
+                <w:szCs w:val="16"/>
+              </w:rPr>
+              <w:t xml:space="preserve">Optional: municipal edition for 3 urban local bodies (one-time)</w:t>
+            </w:r>
+          </w:p>
+        </w:tc>
+        <w:tc>
+          <w:tcPr>
+            <w:tcW w:type="dxa" w:w="3600"/>
+            <w:tcBorders>
+              <w:top w:val="single" w:color="CBD5E1" w:sz="4"/>
+              <w:left w:val="single" w:color="CBD5E1" w:sz="4"/>
+              <w:bottom w:val="single" w:color="CBD5E1" w:sz="4"/>
+              <w:right w:val="single" w:color="CBD5E1" w:sz="4"/>
+            </w:tcBorders>
+            <w:tcMar>
+              <w:top w:type="dxa" w:w="45"/>
+              <w:left w:type="dxa" w:w="110"/>
+              <w:bottom w:type="dxa" w:w="45"/>
               <w:right w:type="dxa" w:w="110"/>
             </w:tcMar>
             <w:vAlign w:val="top"/>
@@ -8800,15 +10843,18 @@
           <w:p>
             <w:pPr>
               <w:spacing w:after="0" w:before="0" w:line="264"/>
-            </w:pPr>
-            <w:r>
-              <w:rPr>
-                <w:rFonts w:ascii="Arial" w:cs="Arial" w:eastAsia="Arial" w:hAnsi="Arial"/>
-                <w:color w:val="1F2937"/>
-                <w:sz w:val="17"/>
-                <w:szCs w:val="17"/>
-              </w:rPr>
-              <w:t xml:space="preserve">₹22 lakh</w:t>
+              <w:jc w:val="right"/>
+            </w:pPr>
+            <w:r>
+              <w:rPr>
+                <w:rFonts w:ascii="Arial" w:cs="Arial" w:eastAsia="Arial" w:hAnsi="Arial"/>
+                <w:b/>
+                <w:bCs/>
+                <w:color w:val="1F2937"/>
+                <w:sz w:val="16"/>
+                <w:szCs w:val="16"/>
+              </w:rPr>
+              <w:t xml:space="preserve">₹15–22 lakh</w:t>
             </w:r>
           </w:p>
         </w:tc>
@@ -8848,7 +10894,7 @@
           <w:sz w:val="19"/>
           <w:szCs w:val="19"/>
         </w:rPr>
-        <w:t xml:space="preserve">The platform already exists; costs cover adaptation to Jharkhand's statutes and registers, integration, deployment, training and support, not development from scratch.</w:t>
+        <w:t xml:space="preserve">The detection engine and console are an existing product, licensed perpetually for use across Government of Jharkhand departments; the pilot licence fee is credited against the full licence. The core product's source code is placed in escrow.</w:t>
       </w:r>
     </w:p>
     <w:p>
@@ -8868,7 +10914,7 @@
           <w:sz w:val="19"/>
           <w:szCs w:val="19"/>
         </w:rPr>
-        <w:t xml:space="preserve">Delivery cost of ₹1.1–1.4 lakh per person-month for a Kolkata-based team with on-site presence in Ranchi.</w:t>
+        <w:t xml:space="preserve">The state owns its data, its Jharkhand-specific rules and rates, the department connectors and the rules the discovery engine finds for it.</w:t>
       </w:r>
     </w:p>
     <w:p>
@@ -8888,7 +10934,7 @@
           <w:sz w:val="19"/>
           <w:szCs w:val="19"/>
         </w:rPr>
-        <w:t xml:space="preserve">The rollout is paid only if the Government proceeds after the pilot's decision gate.</w:t>
+        <w:t xml:space="preserve">Infrastructure is priced for a government-approved cloud; if the Jharkhand State Data Centre (JAP-IT) provides the servers and storage, most of it is absorbed by the state.</w:t>
       </w:r>
     </w:p>
     <w:p>
@@ -8908,30 +10954,13 @@
           <w:sz w:val="19"/>
           <w:szCs w:val="19"/>
         </w:rPr>
-        <w:t xml:space="preserve">If hosted in the Jharkhand State Data Centre (JAP-IT), most infrastructure cost is absorbed by the state.</w:t>
+        <w:t xml:space="preserve">Services are priced at ₹1.1–1.4 lakh per person-month for a Kolkata-based team with on-site presence in Ranchi. All amounts exclude GST and are indicative (±20%) until scoped with the Finance Department.</w:t>
       </w:r>
     </w:p>
     <w:p>
       <w:pPr>
-        <w:pStyle w:val="ListParagraph"/>
-        <w:keepLines/>
-        <w:numPr>
-          <w:ilvl w:val="0"/>
-          <w:numId w:val="2"/>
-        </w:numPr>
-        <w:spacing w:after="50" w:line="256"/>
+        <w:spacing w:after="0" w:before="0" w:line="20"/>
       </w:pPr>
-      <w:r>
-        <w:rPr>
-          <w:rFonts w:ascii="Arial" w:cs="Arial" w:eastAsia="Arial" w:hAnsi="Arial"/>
-          <w:color w:val="1F2937"/>
-          <w:sz w:val="19"/>
-          <w:szCs w:val="19"/>
-        </w:rPr>
-        <w:t xml:space="preserve">All amounts exclude GST and are indicative (±20%) until scoped jointly with the Finance Department.</w:t>
-      </w:r>
-    </w:p>
-    <w:p>
       <w:r>
         <w:br w:type="page"/>
       </w:r>
@@ -8950,7 +10979,7 @@
           <w:sz w:val="28"/>
           <w:szCs w:val="28"/>
         </w:rPr>
-        <w:t xml:space="preserve">8  </w:t>
+        <w:t xml:space="preserve">9  </w:t>
       </w:r>
       <w:r>
         <w:rPr>
@@ -9446,6 +11475,148 @@
                 <w:sz w:val="17"/>
                 <w:szCs w:val="17"/>
               </w:rPr>
+              <w:t xml:space="preserve">Data extracts load department systems</w:t>
+            </w:r>
+          </w:p>
+        </w:tc>
+        <w:tc>
+          <w:tcPr>
+            <w:tcW w:type="dxa" w:w="7006"/>
+            <w:tcBorders>
+              <w:top w:val="single" w:color="CBD5E1" w:sz="4"/>
+              <w:left w:val="single" w:color="CBD5E1" w:sz="4"/>
+              <w:bottom w:val="single" w:color="CBD5E1" w:sz="4"/>
+              <w:right w:val="single" w:color="CBD5E1" w:sz="4"/>
+            </w:tcBorders>
+            <w:tcMar>
+              <w:top w:type="dxa" w:w="60"/>
+              <w:left w:type="dxa" w:w="110"/>
+              <w:bottom w:type="dxa" w:w="60"/>
+              <w:right w:type="dxa" w:w="110"/>
+            </w:tcMar>
+            <w:vAlign w:val="top"/>
+          </w:tcPr>
+          <w:p>
+            <w:pPr>
+              <w:spacing w:after="0" w:before="0" w:line="264"/>
+            </w:pPr>
+            <w:r>
+              <w:rPr>
+                <w:rFonts w:ascii="Arial" w:cs="Arial" w:eastAsia="Arial" w:hAnsi="Arial"/>
+                <w:color w:val="1F2937"/>
+                <w:sz w:val="17"/>
+                <w:szCs w:val="17"/>
+              </w:rPr>
+              <w:t xml:space="preserve">Scheduled off-peak extracts, read replicas or change capture where available; frequency agreed with each department.</w:t>
+            </w:r>
+          </w:p>
+        </w:tc>
+      </w:tr>
+      <w:tr>
+        <w:trPr>
+          <w:cantSplit/>
+        </w:trPr>
+        <w:tc>
+          <w:tcPr>
+            <w:tcW w:type="dxa" w:w="3200"/>
+            <w:tcBorders>
+              <w:top w:val="single" w:color="CBD5E1" w:sz="4"/>
+              <w:left w:val="single" w:color="CBD5E1" w:sz="4"/>
+              <w:bottom w:val="single" w:color="CBD5E1" w:sz="4"/>
+              <w:right w:val="single" w:color="CBD5E1" w:sz="4"/>
+            </w:tcBorders>
+            <w:tcMar>
+              <w:top w:type="dxa" w:w="60"/>
+              <w:left w:type="dxa" w:w="110"/>
+              <w:bottom w:type="dxa" w:w="60"/>
+              <w:right w:type="dxa" w:w="110"/>
+            </w:tcMar>
+            <w:vAlign w:val="top"/>
+          </w:tcPr>
+          <w:p>
+            <w:pPr>
+              <w:spacing w:after="0" w:before="0" w:line="264"/>
+            </w:pPr>
+            <w:r>
+              <w:rPr>
+                <w:rFonts w:ascii="Arial" w:cs="Arial" w:eastAsia="Arial" w:hAnsi="Arial"/>
+                <w:b/>
+                <w:bCs/>
+                <w:color w:val="1F2937"/>
+                <w:sz w:val="17"/>
+                <w:szCs w:val="17"/>
+              </w:rPr>
+              <w:t xml:space="preserve">ML proposes an unsound rule</w:t>
+            </w:r>
+          </w:p>
+        </w:tc>
+        <w:tc>
+          <w:tcPr>
+            <w:tcW w:type="dxa" w:w="7006"/>
+            <w:tcBorders>
+              <w:top w:val="single" w:color="CBD5E1" w:sz="4"/>
+              <w:left w:val="single" w:color="CBD5E1" w:sz="4"/>
+              <w:bottom w:val="single" w:color="CBD5E1" w:sz="4"/>
+              <w:right w:val="single" w:color="CBD5E1" w:sz="4"/>
+            </w:tcBorders>
+            <w:tcMar>
+              <w:top w:type="dxa" w:w="60"/>
+              <w:left w:type="dxa" w:w="110"/>
+              <w:bottom w:type="dxa" w:w="60"/>
+              <w:right w:type="dxa" w:w="110"/>
+            </w:tcMar>
+            <w:vAlign w:val="top"/>
+          </w:tcPr>
+          <w:p>
+            <w:pPr>
+              <w:spacing w:after="0" w:before="0" w:line="264"/>
+            </w:pPr>
+            <w:r>
+              <w:rPr>
+                <w:rFonts w:ascii="Arial" w:cs="Arial" w:eastAsia="Arial" w:hAnsi="Arial"/>
+                <w:color w:val="1F2937"/>
+                <w:sz w:val="17"/>
+                <w:szCs w:val="17"/>
+              </w:rPr>
+              <w:t xml:space="preserve">Back-testing and officer review before any rule is used; the ML never raises a case directly.</w:t>
+            </w:r>
+          </w:p>
+        </w:tc>
+      </w:tr>
+      <w:tr>
+        <w:trPr>
+          <w:cantSplit/>
+        </w:trPr>
+        <w:tc>
+          <w:tcPr>
+            <w:tcW w:type="dxa" w:w="3200"/>
+            <w:tcBorders>
+              <w:top w:val="single" w:color="CBD5E1" w:sz="4"/>
+              <w:left w:val="single" w:color="CBD5E1" w:sz="4"/>
+              <w:bottom w:val="single" w:color="CBD5E1" w:sz="4"/>
+              <w:right w:val="single" w:color="CBD5E1" w:sz="4"/>
+            </w:tcBorders>
+            <w:tcMar>
+              <w:top w:type="dxa" w:w="60"/>
+              <w:left w:type="dxa" w:w="110"/>
+              <w:bottom w:type="dxa" w:w="60"/>
+              <w:right w:type="dxa" w:w="110"/>
+            </w:tcMar>
+            <w:vAlign w:val="top"/>
+          </w:tcPr>
+          <w:p>
+            <w:pPr>
+              <w:spacing w:after="0" w:before="0" w:line="264"/>
+            </w:pPr>
+            <w:r>
+              <w:rPr>
+                <w:rFonts w:ascii="Arial" w:cs="Arial" w:eastAsia="Arial" w:hAnsi="Arial"/>
+                <w:b/>
+                <w:bCs/>
+                <w:color w:val="1F2937"/>
+                <w:sz w:val="17"/>
+                <w:szCs w:val="17"/>
+              </w:rPr>
               <w:t xml:space="preserve">Privacy and misuse</w:t>
             </w:r>
           </w:p>
@@ -9498,7 +11669,7 @@
           <w:sz w:val="28"/>
           <w:szCs w:val="28"/>
         </w:rPr>
-        <w:t xml:space="preserve">9  </w:t>
+        <w:t xml:space="preserve">10  </w:t>
       </w:r>
       <w:r>
         <w:rPr>
@@ -9737,7 +11908,7 @@
                 <w:sz w:val="18"/>
                 <w:szCs w:val="18"/>
               </w:rPr>
-              <w:t xml:space="preserve">Read-only connections; hosting in the Jharkhand State Data Centre or a government-approved Indian cloud.</w:t>
+              <w:t xml:space="preserve">Read-only extracts into a data lake hosted in the Jharkhand State Data Centre or a government-approved Indian cloud.</w:t>
             </w:r>
           </w:p>
         </w:tc>
@@ -9808,78 +11979,7 @@
                 <w:sz w:val="18"/>
                 <w:szCs w:val="18"/>
               </w:rPr>
-              <w:t xml:space="preserve">Open-source technology, source code in escrow, full documentation and training for departmental officers.</w:t>
-            </w:r>
-          </w:p>
-        </w:tc>
-      </w:tr>
-      <w:tr>
-        <w:trPr>
-          <w:cantSplit/>
-        </w:trPr>
-        <w:tc>
-          <w:tcPr>
-            <w:tcW w:type="dxa" w:w="2800"/>
-            <w:tcBorders>
-              <w:top w:val="single" w:color="CBD5E1" w:sz="4"/>
-              <w:left w:val="single" w:color="CBD5E1" w:sz="4"/>
-              <w:bottom w:val="single" w:color="CBD5E1" w:sz="4"/>
-              <w:right w:val="single" w:color="CBD5E1" w:sz="4"/>
-            </w:tcBorders>
-            <w:tcMar>
-              <w:top w:type="dxa" w:w="80"/>
-              <w:left w:type="dxa" w:w="110"/>
-              <w:bottom w:type="dxa" w:w="80"/>
-              <w:right w:type="dxa" w:w="110"/>
-            </w:tcMar>
-            <w:vAlign w:val="top"/>
-          </w:tcPr>
-          <w:p>
-            <w:pPr>
-              <w:spacing w:after="0" w:before="0" w:line="264"/>
-            </w:pPr>
-            <w:r>
-              <w:rPr>
-                <w:rFonts w:ascii="Arial" w:cs="Arial" w:eastAsia="Arial" w:hAnsi="Arial"/>
-                <w:b/>
-                <w:bCs/>
-                <w:color w:val="1F2937"/>
-                <w:sz w:val="18"/>
-                <w:szCs w:val="18"/>
-              </w:rPr>
-              <w:t xml:space="preserve">Hindi and English</w:t>
-            </w:r>
-          </w:p>
-        </w:tc>
-        <w:tc>
-          <w:tcPr>
-            <w:tcW w:type="dxa" w:w="7406"/>
-            <w:tcBorders>
-              <w:top w:val="single" w:color="CBD5E1" w:sz="4"/>
-              <w:left w:val="single" w:color="CBD5E1" w:sz="4"/>
-              <w:bottom w:val="single" w:color="CBD5E1" w:sz="4"/>
-              <w:right w:val="single" w:color="CBD5E1" w:sz="4"/>
-            </w:tcBorders>
-            <w:tcMar>
-              <w:top w:type="dxa" w:w="80"/>
-              <w:left w:type="dxa" w:w="110"/>
-              <w:bottom w:type="dxa" w:w="80"/>
-              <w:right w:type="dxa" w:w="110"/>
-            </w:tcMar>
-            <w:vAlign w:val="top"/>
-          </w:tcPr>
-          <w:p>
-            <w:pPr>
-              <w:spacing w:after="0" w:before="0" w:line="264"/>
-            </w:pPr>
-            <w:r>
-              <w:rPr>
-                <w:rFonts w:ascii="Arial" w:cs="Arial" w:eastAsia="Arial" w:hAnsi="Arial"/>
-                <w:color w:val="1F2937"/>
-                <w:sz w:val="18"/>
-                <w:szCs w:val="18"/>
-              </w:rPr>
-              <w:t xml:space="preserve">All screens, reports and the assistant in Hindi and English.</w:t>
+              <w:t xml:space="preserve">Open-source data components (Trino, open table formats); product source code in escrow; the state owns its data, rules and connectors; full documentation and training.</w:t>
             </w:r>
           </w:p>
         </w:tc>
@@ -9970,7 +12070,7 @@
           <w:sz w:val="20"/>
           <w:szCs w:val="20"/>
         </w:rPr>
-        <w:t xml:space="preserve">Sources (public information, accessed September 2026)</w:t>
+        <w:t xml:space="preserve">Sources (public information, accessed September 2026; status descriptions to be confirmed with the Departments)</w:t>
       </w:r>
     </w:p>
     <w:p>
@@ -10335,22 +12435,6 @@
           <w:szCs w:val="15"/>
         </w:rPr>
         <w:t xml:space="preserve">https://en.wikipedia.org/wiki/Department_of_Commercial_Taxes_(Jharkhand)</w:t>
-      </w:r>
-    </w:p>
-    <w:p>
-      <w:pPr>
-        <w:spacing w:after="80" w:before="120" w:line="264"/>
-      </w:pPr>
-      <w:r>
-        <w:rPr>
-          <w:rFonts w:ascii="Arial" w:cs="Arial" w:eastAsia="Arial" w:hAnsi="Arial"/>
-          <w:i/>
-          <w:iCs/>
-          <w:color w:val="5B6472"/>
-          <w:sz w:val="17"/>
-          <w:szCs w:val="17"/>
-        </w:rPr>
-        <w:t xml:space="preserve">Status descriptions are based on public information up to September 2026 and should be confirmed with the Departments before formal submission.</w:t>
       </w:r>
     </w:p>
     <w:sectPr>

</xml_diff>